<commit_message>
saving changes in DF_Assignment_04_Spring_2026.docx
</commit_message>
<xml_diff>
--- a/DF_Assignment_04_Spring_2026.docx
+++ b/DF_Assignment_04_Spring_2026.docx
@@ -348,7 +348,27 @@
           <w:sz w:val="24"/>
           <w:szCs w:val="24"/>
         </w:rPr>
-        <w:t xml:space="preserve"> (can be six members but in that case TL has to create an additional page for that member and then assign all tasks accordingly)</w:t>
+        <w:t xml:space="preserve"> (can be six members but in that </w:t>
+      </w:r>
+      <w:proofErr w:type="gramStart"/>
+      <w:r>
+        <w:rPr>
+          <w:rFonts w:ascii="Arial" w:eastAsia="Arial" w:hAnsi="Arial" w:cs="Arial"/>
+          <w:color w:val="000000"/>
+          <w:sz w:val="24"/>
+          <w:szCs w:val="24"/>
+        </w:rPr>
+        <w:t>case</w:t>
+      </w:r>
+      <w:proofErr w:type="gramEnd"/>
+      <w:r>
+        <w:rPr>
+          <w:rFonts w:ascii="Arial" w:eastAsia="Arial" w:hAnsi="Arial" w:cs="Arial"/>
+          <w:color w:val="000000"/>
+          <w:sz w:val="24"/>
+          <w:szCs w:val="24"/>
+        </w:rPr>
+        <w:t xml:space="preserve"> TL has to create an additional page for that member and then assign all tasks accordingly)</w:t>
       </w:r>
     </w:p>
     <w:p>
@@ -592,8 +612,9 @@
           <w:sz w:val="18"/>
           <w:szCs w:val="18"/>
         </w:rPr>
-        <w:t xml:space="preserve">Table 1: Group Details </w:t>
-      </w:r>
+        <w:t xml:space="preserve">Table 1: Group </w:t>
+      </w:r>
+      <w:proofErr w:type="gramStart"/>
       <w:r>
         <w:rPr>
           <w:rFonts w:ascii="Arial" w:eastAsia="Arial" w:hAnsi="Arial" w:cs="Arial"/>
@@ -603,7 +624,7 @@
           <w:sz w:val="18"/>
           <w:szCs w:val="18"/>
         </w:rPr>
-        <w:t>,</w:t>
+        <w:t xml:space="preserve">Details </w:t>
       </w:r>
       <w:r>
         <w:rPr>
@@ -614,7 +635,43 @@
           <w:sz w:val="18"/>
           <w:szCs w:val="18"/>
         </w:rPr>
-        <w:t xml:space="preserve"> Each student must fill their own row (including Assigned Page) in the versioned copy inside the repo</w:t>
+        <w:t>,</w:t>
+      </w:r>
+      <w:proofErr w:type="gramEnd"/>
+      <w:r>
+        <w:rPr>
+          <w:rFonts w:ascii="Arial" w:eastAsia="Arial" w:hAnsi="Arial" w:cs="Arial"/>
+          <w:b/>
+          <w:bCs/>
+          <w:color w:val="444444"/>
+          <w:sz w:val="18"/>
+          <w:szCs w:val="18"/>
+        </w:rPr>
+        <w:t xml:space="preserve"> </w:t>
+      </w:r>
+      <w:proofErr w:type="gramStart"/>
+      <w:r>
+        <w:rPr>
+          <w:rFonts w:ascii="Arial" w:eastAsia="Arial" w:hAnsi="Arial" w:cs="Arial"/>
+          <w:b/>
+          <w:bCs/>
+          <w:color w:val="444444"/>
+          <w:sz w:val="18"/>
+          <w:szCs w:val="18"/>
+        </w:rPr>
+        <w:t>Each</w:t>
+      </w:r>
+      <w:proofErr w:type="gramEnd"/>
+      <w:r>
+        <w:rPr>
+          <w:rFonts w:ascii="Arial" w:eastAsia="Arial" w:hAnsi="Arial" w:cs="Arial"/>
+          <w:b/>
+          <w:bCs/>
+          <w:color w:val="444444"/>
+          <w:sz w:val="18"/>
+          <w:szCs w:val="18"/>
+        </w:rPr>
+        <w:t xml:space="preserve"> student must fill their own row (including Assigned Page) in the versioned copy inside the repo</w:t>
       </w:r>
     </w:p>
     <w:tbl>
@@ -635,13 +692,13 @@
         <w:tblLook w:val="0000" w:firstRow="0" w:lastRow="0" w:firstColumn="0" w:lastColumn="0" w:noHBand="0" w:noVBand="0"/>
       </w:tblPr>
       <w:tblGrid>
-        <w:gridCol w:w="471"/>
-        <w:gridCol w:w="1523"/>
-        <w:gridCol w:w="1858"/>
-        <w:gridCol w:w="1561"/>
-        <w:gridCol w:w="1193"/>
-        <w:gridCol w:w="1253"/>
-        <w:gridCol w:w="1501"/>
+        <w:gridCol w:w="466"/>
+        <w:gridCol w:w="1220"/>
+        <w:gridCol w:w="1813"/>
+        <w:gridCol w:w="1525"/>
+        <w:gridCol w:w="1174"/>
+        <w:gridCol w:w="2536"/>
+        <w:gridCol w:w="1330"/>
       </w:tblGrid>
       <w:tr>
         <w:trPr>
@@ -681,7 +738,7 @@
         </w:tc>
         <w:tc>
           <w:tcPr>
-            <w:tcW w:w="1771" w:type="dxa"/>
+            <w:tcW w:w="1523" w:type="dxa"/>
             <w:tcBorders>
               <w:top w:val="single" w:sz="6" w:space="0" w:color="ADB9CA"/>
               <w:left w:val="single" w:sz="6" w:space="0" w:color="ADB9CA"/>
@@ -713,7 +770,7 @@
         </w:tc>
         <w:tc>
           <w:tcPr>
-            <w:tcW w:w="1112" w:type="dxa"/>
+            <w:tcW w:w="1858" w:type="dxa"/>
             <w:tcBorders>
               <w:top w:val="single" w:sz="6" w:space="0" w:color="ADB9CA"/>
               <w:left w:val="single" w:sz="6" w:space="0" w:color="ADB9CA"/>
@@ -777,7 +834,7 @@
         </w:tc>
         <w:tc>
           <w:tcPr>
-            <w:tcW w:w="1285" w:type="dxa"/>
+            <w:tcW w:w="1193" w:type="dxa"/>
             <w:tcBorders>
               <w:top w:val="single" w:sz="6" w:space="0" w:color="ADB9CA"/>
               <w:left w:val="single" w:sz="6" w:space="0" w:color="ADB9CA"/>
@@ -809,7 +866,7 @@
         </w:tc>
         <w:tc>
           <w:tcPr>
-            <w:tcW w:w="1534" w:type="dxa"/>
+            <w:tcW w:w="1253" w:type="dxa"/>
             <w:tcBorders>
               <w:top w:val="single" w:sz="6" w:space="0" w:color="ADB9CA"/>
               <w:left w:val="single" w:sz="6" w:space="0" w:color="ADB9CA"/>
@@ -841,7 +898,7 @@
         </w:tc>
         <w:tc>
           <w:tcPr>
-            <w:tcW w:w="1626" w:type="dxa"/>
+            <w:tcW w:w="1501" w:type="dxa"/>
             <w:tcBorders>
               <w:top w:val="single" w:sz="6" w:space="0" w:color="ADB9CA"/>
               <w:left w:val="single" w:sz="6" w:space="0" w:color="ADB9CA"/>
@@ -905,7 +962,7 @@
         </w:tc>
         <w:tc>
           <w:tcPr>
-            <w:tcW w:w="1771" w:type="dxa"/>
+            <w:tcW w:w="1523" w:type="dxa"/>
             <w:tcBorders>
               <w:top w:val="single" w:sz="6" w:space="0" w:color="ADB9CA"/>
               <w:left w:val="single" w:sz="6" w:space="0" w:color="ADB9CA"/>
@@ -929,7 +986,7 @@
         </w:tc>
         <w:tc>
           <w:tcPr>
-            <w:tcW w:w="1112" w:type="dxa"/>
+            <w:tcW w:w="1858" w:type="dxa"/>
             <w:tcBorders>
               <w:top w:val="single" w:sz="6" w:space="0" w:color="ADB9CA"/>
               <w:left w:val="single" w:sz="6" w:space="0" w:color="ADB9CA"/>
@@ -977,7 +1034,7 @@
         </w:tc>
         <w:tc>
           <w:tcPr>
-            <w:tcW w:w="1285" w:type="dxa"/>
+            <w:tcW w:w="1193" w:type="dxa"/>
             <w:tcBorders>
               <w:top w:val="single" w:sz="6" w:space="0" w:color="ADB9CA"/>
               <w:left w:val="single" w:sz="6" w:space="0" w:color="ADB9CA"/>
@@ -993,11 +1050,23 @@
             </w:tcMar>
             <w:vAlign w:val="center"/>
           </w:tcPr>
-          <w:p/>
-        </w:tc>
-        <w:tc>
-          <w:tcPr>
-            <w:tcW w:w="1534" w:type="dxa"/>
+          <w:p>
+            <w:r>
+              <w:rPr>
+                <w:rFonts w:ascii="Arial" w:eastAsia="Arial" w:hAnsi="Arial" w:cs="Arial"/>
+                <w:b/>
+                <w:bCs/>
+                <w:color w:val="000000"/>
+                <w:sz w:val="18"/>
+                <w:szCs w:val="18"/>
+              </w:rPr>
+              <w:t>index.html</w:t>
+            </w:r>
+          </w:p>
+        </w:tc>
+        <w:tc>
+          <w:tcPr>
+            <w:tcW w:w="1253" w:type="dxa"/>
             <w:tcBorders>
               <w:top w:val="single" w:sz="6" w:space="0" w:color="ADB9CA"/>
               <w:left w:val="single" w:sz="6" w:space="0" w:color="ADB9CA"/>
@@ -1013,11 +1082,24 @@
             </w:tcMar>
             <w:vAlign w:val="center"/>
           </w:tcPr>
-          <w:p/>
-        </w:tc>
-        <w:tc>
-          <w:tcPr>
-            <w:tcW w:w="1626" w:type="dxa"/>
+          <w:p>
+            <w:r>
+              <w:t>D</w:t>
+            </w:r>
+            <w:r>
+              <w:t>evelop</w:t>
+            </w:r>
+            <w:r>
+              <w:t xml:space="preserve">, </w:t>
+            </w:r>
+            <w:r>
+              <w:t>manaf430-patch-1</w:t>
+            </w:r>
+          </w:p>
+        </w:tc>
+        <w:tc>
+          <w:tcPr>
+            <w:tcW w:w="1501" w:type="dxa"/>
             <w:tcBorders>
               <w:top w:val="single" w:sz="6" w:space="0" w:color="ADB9CA"/>
               <w:left w:val="single" w:sz="6" w:space="0" w:color="ADB9CA"/>
@@ -1033,7 +1115,11 @@
             </w:tcMar>
             <w:vAlign w:val="center"/>
           </w:tcPr>
-          <w:p/>
+          <w:p>
+            <w:r>
+              <w:t>yes</w:t>
+            </w:r>
+          </w:p>
         </w:tc>
       </w:tr>
       <w:tr>
@@ -1069,7 +1155,7 @@
         </w:tc>
         <w:tc>
           <w:tcPr>
-            <w:tcW w:w="1771" w:type="dxa"/>
+            <w:tcW w:w="1523" w:type="dxa"/>
             <w:tcBorders>
               <w:top w:val="single" w:sz="6" w:space="0" w:color="ADB9CA"/>
               <w:left w:val="single" w:sz="6" w:space="0" w:color="ADB9CA"/>
@@ -1093,7 +1179,7 @@
         </w:tc>
         <w:tc>
           <w:tcPr>
-            <w:tcW w:w="1112" w:type="dxa"/>
+            <w:tcW w:w="1858" w:type="dxa"/>
             <w:tcBorders>
               <w:top w:val="single" w:sz="6" w:space="0" w:color="ADB9CA"/>
               <w:left w:val="single" w:sz="6" w:space="0" w:color="ADB9CA"/>
@@ -1141,7 +1227,7 @@
         </w:tc>
         <w:tc>
           <w:tcPr>
-            <w:tcW w:w="1285" w:type="dxa"/>
+            <w:tcW w:w="1193" w:type="dxa"/>
             <w:tcBorders>
               <w:top w:val="single" w:sz="6" w:space="0" w:color="ADB9CA"/>
               <w:left w:val="single" w:sz="6" w:space="0" w:color="ADB9CA"/>
@@ -1157,11 +1243,23 @@
             </w:tcMar>
             <w:vAlign w:val="center"/>
           </w:tcPr>
-          <w:p/>
-        </w:tc>
-        <w:tc>
-          <w:tcPr>
-            <w:tcW w:w="1534" w:type="dxa"/>
+          <w:p>
+            <w:r>
+              <w:rPr>
+                <w:rFonts w:ascii="Arial" w:eastAsia="Arial" w:hAnsi="Arial" w:cs="Arial"/>
+                <w:b/>
+                <w:bCs/>
+                <w:color w:val="000000"/>
+                <w:sz w:val="18"/>
+                <w:szCs w:val="18"/>
+              </w:rPr>
+              <w:t>add-task.html</w:t>
+            </w:r>
+          </w:p>
+        </w:tc>
+        <w:tc>
+          <w:tcPr>
+            <w:tcW w:w="1253" w:type="dxa"/>
             <w:tcBorders>
               <w:top w:val="single" w:sz="6" w:space="0" w:color="ADB9CA"/>
               <w:left w:val="single" w:sz="6" w:space="0" w:color="ADB9CA"/>
@@ -1177,11 +1275,23 @@
             </w:tcMar>
             <w:vAlign w:val="center"/>
           </w:tcPr>
-          <w:p/>
-        </w:tc>
-        <w:tc>
-          <w:tcPr>
-            <w:tcW w:w="1626" w:type="dxa"/>
+          <w:p>
+            <w:r>
+              <w:t>feature/</w:t>
+            </w:r>
+            <w:proofErr w:type="spellStart"/>
+            <w:r>
+              <w:t>ahad</w:t>
+            </w:r>
+            <w:proofErr w:type="spellEnd"/>
+            <w:r>
+              <w:t>/add-task</w:t>
+            </w:r>
+          </w:p>
+        </w:tc>
+        <w:tc>
+          <w:tcPr>
+            <w:tcW w:w="1501" w:type="dxa"/>
             <w:tcBorders>
               <w:top w:val="single" w:sz="6" w:space="0" w:color="ADB9CA"/>
               <w:left w:val="single" w:sz="6" w:space="0" w:color="ADB9CA"/>
@@ -1197,7 +1307,11 @@
             </w:tcMar>
             <w:vAlign w:val="center"/>
           </w:tcPr>
-          <w:p/>
+          <w:p>
+            <w:r>
+              <w:t>yes</w:t>
+            </w:r>
+          </w:p>
         </w:tc>
       </w:tr>
       <w:tr>
@@ -1233,7 +1347,7 @@
         </w:tc>
         <w:tc>
           <w:tcPr>
-            <w:tcW w:w="1771" w:type="dxa"/>
+            <w:tcW w:w="1523" w:type="dxa"/>
             <w:tcBorders>
               <w:top w:val="single" w:sz="6" w:space="0" w:color="ADB9CA"/>
               <w:left w:val="single" w:sz="6" w:space="0" w:color="ADB9CA"/>
@@ -1257,7 +1371,7 @@
         </w:tc>
         <w:tc>
           <w:tcPr>
-            <w:tcW w:w="1112" w:type="dxa"/>
+            <w:tcW w:w="1858" w:type="dxa"/>
             <w:tcBorders>
               <w:top w:val="single" w:sz="6" w:space="0" w:color="ADB9CA"/>
               <w:left w:val="single" w:sz="6" w:space="0" w:color="ADB9CA"/>
@@ -1305,7 +1419,7 @@
         </w:tc>
         <w:tc>
           <w:tcPr>
-            <w:tcW w:w="1285" w:type="dxa"/>
+            <w:tcW w:w="1193" w:type="dxa"/>
             <w:tcBorders>
               <w:top w:val="single" w:sz="6" w:space="0" w:color="ADB9CA"/>
               <w:left w:val="single" w:sz="6" w:space="0" w:color="ADB9CA"/>
@@ -1321,11 +1435,23 @@
             </w:tcMar>
             <w:vAlign w:val="center"/>
           </w:tcPr>
-          <w:p/>
-        </w:tc>
-        <w:tc>
-          <w:tcPr>
-            <w:tcW w:w="1534" w:type="dxa"/>
+          <w:p>
+            <w:r>
+              <w:rPr>
+                <w:rFonts w:ascii="Arial" w:eastAsia="Arial" w:hAnsi="Arial" w:cs="Arial"/>
+                <w:b/>
+                <w:bCs/>
+                <w:color w:val="000000"/>
+                <w:sz w:val="18"/>
+                <w:szCs w:val="18"/>
+              </w:rPr>
+              <w:t>task-list.html</w:t>
+            </w:r>
+          </w:p>
+        </w:tc>
+        <w:tc>
+          <w:tcPr>
+            <w:tcW w:w="1253" w:type="dxa"/>
             <w:tcBorders>
               <w:top w:val="single" w:sz="6" w:space="0" w:color="ADB9CA"/>
               <w:left w:val="single" w:sz="6" w:space="0" w:color="ADB9CA"/>
@@ -1341,11 +1467,15 @@
             </w:tcMar>
             <w:vAlign w:val="center"/>
           </w:tcPr>
-          <w:p/>
-        </w:tc>
-        <w:tc>
-          <w:tcPr>
-            <w:tcW w:w="1626" w:type="dxa"/>
+          <w:p>
+            <w:r>
+              <w:t>feature/FaizanAsim2k4/task-list</w:t>
+            </w:r>
+          </w:p>
+        </w:tc>
+        <w:tc>
+          <w:tcPr>
+            <w:tcW w:w="1501" w:type="dxa"/>
             <w:tcBorders>
               <w:top w:val="single" w:sz="6" w:space="0" w:color="ADB9CA"/>
               <w:left w:val="single" w:sz="6" w:space="0" w:color="ADB9CA"/>
@@ -1361,7 +1491,11 @@
             </w:tcMar>
             <w:vAlign w:val="center"/>
           </w:tcPr>
-          <w:p/>
+          <w:p>
+            <w:r>
+              <w:t>yes</w:t>
+            </w:r>
+          </w:p>
         </w:tc>
       </w:tr>
       <w:tr>
@@ -1397,7 +1531,7 @@
         </w:tc>
         <w:tc>
           <w:tcPr>
-            <w:tcW w:w="1771" w:type="dxa"/>
+            <w:tcW w:w="1523" w:type="dxa"/>
             <w:tcBorders>
               <w:top w:val="single" w:sz="6" w:space="0" w:color="ADB9CA"/>
               <w:left w:val="single" w:sz="6" w:space="0" w:color="ADB9CA"/>
@@ -1421,7 +1555,7 @@
         </w:tc>
         <w:tc>
           <w:tcPr>
-            <w:tcW w:w="1112" w:type="dxa"/>
+            <w:tcW w:w="1858" w:type="dxa"/>
             <w:tcBorders>
               <w:top w:val="single" w:sz="6" w:space="0" w:color="ADB9CA"/>
               <w:left w:val="single" w:sz="6" w:space="0" w:color="ADB9CA"/>
@@ -1469,7 +1603,7 @@
         </w:tc>
         <w:tc>
           <w:tcPr>
-            <w:tcW w:w="1285" w:type="dxa"/>
+            <w:tcW w:w="1193" w:type="dxa"/>
             <w:tcBorders>
               <w:top w:val="single" w:sz="6" w:space="0" w:color="ADB9CA"/>
               <w:left w:val="single" w:sz="6" w:space="0" w:color="ADB9CA"/>
@@ -1485,11 +1619,23 @@
             </w:tcMar>
             <w:vAlign w:val="center"/>
           </w:tcPr>
-          <w:p/>
-        </w:tc>
-        <w:tc>
-          <w:tcPr>
-            <w:tcW w:w="1534" w:type="dxa"/>
+          <w:p>
+            <w:r>
+              <w:rPr>
+                <w:rFonts w:ascii="Arial" w:eastAsia="Arial" w:hAnsi="Arial" w:cs="Arial"/>
+                <w:b/>
+                <w:bCs/>
+                <w:color w:val="000000"/>
+                <w:sz w:val="18"/>
+                <w:szCs w:val="18"/>
+              </w:rPr>
+              <w:t>task-detail.html</w:t>
+            </w:r>
+          </w:p>
+        </w:tc>
+        <w:tc>
+          <w:tcPr>
+            <w:tcW w:w="1253" w:type="dxa"/>
             <w:tcBorders>
               <w:top w:val="single" w:sz="6" w:space="0" w:color="ADB9CA"/>
               <w:left w:val="single" w:sz="6" w:space="0" w:color="ADB9CA"/>
@@ -1505,11 +1651,15 @@
             </w:tcMar>
             <w:vAlign w:val="center"/>
           </w:tcPr>
-          <w:p/>
-        </w:tc>
-        <w:tc>
-          <w:tcPr>
-            <w:tcW w:w="1626" w:type="dxa"/>
+          <w:p>
+            <w:r>
+              <w:t>feature/MuHammad-Zain22/task-detail</w:t>
+            </w:r>
+          </w:p>
+        </w:tc>
+        <w:tc>
+          <w:tcPr>
+            <w:tcW w:w="1501" w:type="dxa"/>
             <w:tcBorders>
               <w:top w:val="single" w:sz="6" w:space="0" w:color="ADB9CA"/>
               <w:left w:val="single" w:sz="6" w:space="0" w:color="ADB9CA"/>
@@ -1525,7 +1675,11 @@
             </w:tcMar>
             <w:vAlign w:val="center"/>
           </w:tcPr>
-          <w:p/>
+          <w:p>
+            <w:r>
+              <w:t>yes</w:t>
+            </w:r>
+          </w:p>
         </w:tc>
       </w:tr>
       <w:tr>
@@ -1561,7 +1715,7 @@
         </w:tc>
         <w:tc>
           <w:tcPr>
-            <w:tcW w:w="1771" w:type="dxa"/>
+            <w:tcW w:w="1523" w:type="dxa"/>
             <w:tcBorders>
               <w:top w:val="single" w:sz="6" w:space="0" w:color="ADB9CA"/>
               <w:left w:val="single" w:sz="6" w:space="0" w:color="ADB9CA"/>
@@ -1585,7 +1739,7 @@
         </w:tc>
         <w:tc>
           <w:tcPr>
-            <w:tcW w:w="1112" w:type="dxa"/>
+            <w:tcW w:w="1858" w:type="dxa"/>
             <w:tcBorders>
               <w:top w:val="single" w:sz="6" w:space="0" w:color="ADB9CA"/>
               <w:left w:val="single" w:sz="6" w:space="0" w:color="ADB9CA"/>
@@ -1633,7 +1787,7 @@
         </w:tc>
         <w:tc>
           <w:tcPr>
-            <w:tcW w:w="1285" w:type="dxa"/>
+            <w:tcW w:w="1193" w:type="dxa"/>
             <w:tcBorders>
               <w:top w:val="single" w:sz="6" w:space="0" w:color="ADB9CA"/>
               <w:left w:val="single" w:sz="6" w:space="0" w:color="ADB9CA"/>
@@ -1649,11 +1803,23 @@
             </w:tcMar>
             <w:vAlign w:val="center"/>
           </w:tcPr>
-          <w:p/>
-        </w:tc>
-        <w:tc>
-          <w:tcPr>
-            <w:tcW w:w="1534" w:type="dxa"/>
+          <w:p>
+            <w:r>
+              <w:rPr>
+                <w:rFonts w:ascii="Arial" w:eastAsia="Arial" w:hAnsi="Arial" w:cs="Arial"/>
+                <w:b/>
+                <w:bCs/>
+                <w:color w:val="000000"/>
+                <w:sz w:val="18"/>
+                <w:szCs w:val="18"/>
+              </w:rPr>
+              <w:t>about.html</w:t>
+            </w:r>
+          </w:p>
+        </w:tc>
+        <w:tc>
+          <w:tcPr>
+            <w:tcW w:w="1253" w:type="dxa"/>
             <w:tcBorders>
               <w:top w:val="single" w:sz="6" w:space="0" w:color="ADB9CA"/>
               <w:left w:val="single" w:sz="6" w:space="0" w:color="ADB9CA"/>
@@ -1669,11 +1835,23 @@
             </w:tcMar>
             <w:vAlign w:val="center"/>
           </w:tcPr>
-          <w:p/>
-        </w:tc>
-        <w:tc>
-          <w:tcPr>
-            <w:tcW w:w="1626" w:type="dxa"/>
+          <w:p>
+            <w:r>
+              <w:t>feature/</w:t>
+            </w:r>
+            <w:proofErr w:type="spellStart"/>
+            <w:r>
+              <w:t>ashha</w:t>
+            </w:r>
+            <w:proofErr w:type="spellEnd"/>
+            <w:r>
+              <w:t>/about</w:t>
+            </w:r>
+          </w:p>
+        </w:tc>
+        <w:tc>
+          <w:tcPr>
+            <w:tcW w:w="1501" w:type="dxa"/>
             <w:tcBorders>
               <w:top w:val="single" w:sz="6" w:space="0" w:color="ADB9CA"/>
               <w:left w:val="single" w:sz="6" w:space="0" w:color="ADB9CA"/>
@@ -1689,7 +1867,11 @@
             </w:tcMar>
             <w:vAlign w:val="center"/>
           </w:tcPr>
-          <w:p/>
+          <w:p>
+            <w:r>
+              <w:t>yes</w:t>
+            </w:r>
+          </w:p>
         </w:tc>
       </w:tr>
     </w:tbl>
@@ -1773,17 +1955,8 @@
         <w:jc w:val="both"/>
       </w:pPr>
       <w:r>
-        <w:rPr>
-          <w:rFonts w:ascii="Arial" w:eastAsia="Arial" w:hAnsi="Arial" w:cs="Arial"/>
-          <w:color w:val="555555"/>
-        </w:rPr>
-        <w:t>[Paste Your Render Live URL Here]</w:t>
-      </w:r>
-    </w:p>
-    <w:p>
-      <w:pPr>
-        <w:spacing w:after="100"/>
-      </w:pPr>
+        <w:t>https://taskflow-cicd-latest-7prv.onrender.com/index.html</w:t>
+      </w:r>
     </w:p>
     <w:p>
       <w:pPr>
@@ -2332,7 +2505,17 @@
                 <w:sz w:val="18"/>
                 <w:szCs w:val="18"/>
               </w:rPr>
-              <w:t xml:space="preserve">An HTML form allowing the user to enter a new task </w:t>
+              <w:t xml:space="preserve">An HTML form allowing the user to enter a new </w:t>
+            </w:r>
+            <w:proofErr w:type="gramStart"/>
+            <w:r>
+              <w:rPr>
+                <w:rFonts w:ascii="Arial" w:eastAsia="Arial" w:hAnsi="Arial" w:cs="Arial"/>
+                <w:color w:val="000000"/>
+                <w:sz w:val="18"/>
+                <w:szCs w:val="18"/>
+              </w:rPr>
+              <w:t xml:space="preserve">task </w:t>
             </w:r>
             <w:r>
               <w:rPr>
@@ -2343,6 +2526,7 @@
               </w:rPr>
               <w:t>,</w:t>
             </w:r>
+            <w:proofErr w:type="gramEnd"/>
             <w:r>
               <w:rPr>
                 <w:rFonts w:ascii="Arial" w:eastAsia="Arial" w:hAnsi="Arial" w:cs="Arial"/>
@@ -2384,6 +2568,7 @@
                 <w:sz w:val="18"/>
                 <w:szCs w:val="18"/>
               </w:rPr>
+              <w:lastRenderedPageBreak/>
               <w:t>3</w:t>
             </w:r>
           </w:p>
@@ -2636,7 +2821,6 @@
                 <w:sz w:val="18"/>
                 <w:szCs w:val="18"/>
               </w:rPr>
-              <w:lastRenderedPageBreak/>
               <w:t>5</w:t>
             </w:r>
           </w:p>
@@ -2819,7 +3003,23 @@
           <w:rFonts w:ascii="Arial" w:eastAsia="Arial" w:hAnsi="Arial" w:cs="Arial"/>
           <w:color w:val="000000"/>
         </w:rPr>
-        <w:t>-username&gt;/&lt;page-name&gt;  (e.g., feature/</w:t>
+        <w:t>-username&gt;/&lt;page-name</w:t>
+      </w:r>
+      <w:proofErr w:type="gramStart"/>
+      <w:r>
+        <w:rPr>
+          <w:rFonts w:ascii="Arial" w:eastAsia="Arial" w:hAnsi="Arial" w:cs="Arial"/>
+          <w:color w:val="000000"/>
+        </w:rPr>
+        <w:t>&gt;  (</w:t>
+      </w:r>
+      <w:proofErr w:type="gramEnd"/>
+      <w:r>
+        <w:rPr>
+          <w:rFonts w:ascii="Arial" w:eastAsia="Arial" w:hAnsi="Arial" w:cs="Arial"/>
+          <w:color w:val="000000"/>
+        </w:rPr>
+        <w:t>e.g., feature/</w:t>
       </w:r>
       <w:proofErr w:type="spellStart"/>
       <w:r>
@@ -3334,7 +3534,17 @@
                 <w:sz w:val="18"/>
                 <w:szCs w:val="18"/>
               </w:rPr>
-              <w:t xml:space="preserve">Home / Dashboard page </w:t>
+              <w:t xml:space="preserve">Home / Dashboard </w:t>
+            </w:r>
+            <w:proofErr w:type="gramStart"/>
+            <w:r>
+              <w:rPr>
+                <w:rFonts w:ascii="Arial" w:eastAsia="Arial" w:hAnsi="Arial" w:cs="Arial"/>
+                <w:color w:val="000000"/>
+                <w:sz w:val="18"/>
+                <w:szCs w:val="18"/>
+              </w:rPr>
+              <w:t xml:space="preserve">page </w:t>
             </w:r>
             <w:r>
               <w:rPr>
@@ -3345,6 +3555,7 @@
               </w:rPr>
               <w:t>,</w:t>
             </w:r>
+            <w:proofErr w:type="gramEnd"/>
             <w:r>
               <w:rPr>
                 <w:rFonts w:ascii="Arial" w:eastAsia="Arial" w:hAnsi="Arial" w:cs="Arial"/>
@@ -3416,7 +3627,17 @@
                 <w:sz w:val="18"/>
                 <w:szCs w:val="18"/>
               </w:rPr>
-              <w:t xml:space="preserve">Add Task page </w:t>
+              <w:t xml:space="preserve">Add Task </w:t>
+            </w:r>
+            <w:proofErr w:type="gramStart"/>
+            <w:r>
+              <w:rPr>
+                <w:rFonts w:ascii="Arial" w:eastAsia="Arial" w:hAnsi="Arial" w:cs="Arial"/>
+                <w:color w:val="000000"/>
+                <w:sz w:val="18"/>
+                <w:szCs w:val="18"/>
+              </w:rPr>
+              <w:t xml:space="preserve">page </w:t>
             </w:r>
             <w:r>
               <w:rPr>
@@ -3427,6 +3648,7 @@
               </w:rPr>
               <w:t>,</w:t>
             </w:r>
+            <w:proofErr w:type="gramEnd"/>
             <w:r>
               <w:rPr>
                 <w:rFonts w:ascii="Arial" w:eastAsia="Arial" w:hAnsi="Arial" w:cs="Arial"/>
@@ -3498,7 +3720,17 @@
                 <w:sz w:val="18"/>
                 <w:szCs w:val="18"/>
               </w:rPr>
-              <w:t xml:space="preserve">Task List page </w:t>
+              <w:t xml:space="preserve">Task List </w:t>
+            </w:r>
+            <w:proofErr w:type="gramStart"/>
+            <w:r>
+              <w:rPr>
+                <w:rFonts w:ascii="Arial" w:eastAsia="Arial" w:hAnsi="Arial" w:cs="Arial"/>
+                <w:color w:val="000000"/>
+                <w:sz w:val="18"/>
+                <w:szCs w:val="18"/>
+              </w:rPr>
+              <w:t xml:space="preserve">page </w:t>
             </w:r>
             <w:r>
               <w:rPr>
@@ -3509,6 +3741,7 @@
               </w:rPr>
               <w:t>,</w:t>
             </w:r>
+            <w:proofErr w:type="gramEnd"/>
             <w:r>
               <w:rPr>
                 <w:rFonts w:ascii="Arial" w:eastAsia="Arial" w:hAnsi="Arial" w:cs="Arial"/>
@@ -3580,7 +3813,17 @@
                 <w:sz w:val="18"/>
                 <w:szCs w:val="18"/>
               </w:rPr>
-              <w:t xml:space="preserve">Task Detail page </w:t>
+              <w:t xml:space="preserve">Task Detail </w:t>
+            </w:r>
+            <w:proofErr w:type="gramStart"/>
+            <w:r>
+              <w:rPr>
+                <w:rFonts w:ascii="Arial" w:eastAsia="Arial" w:hAnsi="Arial" w:cs="Arial"/>
+                <w:color w:val="000000"/>
+                <w:sz w:val="18"/>
+                <w:szCs w:val="18"/>
+              </w:rPr>
+              <w:t xml:space="preserve">page </w:t>
             </w:r>
             <w:r>
               <w:rPr>
@@ -3591,6 +3834,7 @@
               </w:rPr>
               <w:t>,</w:t>
             </w:r>
+            <w:proofErr w:type="gramEnd"/>
             <w:r>
               <w:rPr>
                 <w:rFonts w:ascii="Arial" w:eastAsia="Arial" w:hAnsi="Arial" w:cs="Arial"/>
@@ -3662,7 +3906,17 @@
                 <w:sz w:val="18"/>
                 <w:szCs w:val="18"/>
               </w:rPr>
-              <w:t xml:space="preserve">About / Help page </w:t>
+              <w:t xml:space="preserve">About / Help </w:t>
+            </w:r>
+            <w:proofErr w:type="gramStart"/>
+            <w:r>
+              <w:rPr>
+                <w:rFonts w:ascii="Arial" w:eastAsia="Arial" w:hAnsi="Arial" w:cs="Arial"/>
+                <w:color w:val="000000"/>
+                <w:sz w:val="18"/>
+                <w:szCs w:val="18"/>
+              </w:rPr>
+              <w:t xml:space="preserve">page </w:t>
             </w:r>
             <w:r>
               <w:rPr>
@@ -3673,6 +3927,7 @@
               </w:rPr>
               <w:t>,</w:t>
             </w:r>
+            <w:proofErr w:type="gramEnd"/>
             <w:r>
               <w:rPr>
                 <w:rFonts w:ascii="Arial" w:eastAsia="Arial" w:hAnsi="Arial" w:cs="Arial"/>
@@ -3714,6 +3969,7 @@
                 <w:sz w:val="18"/>
                 <w:szCs w:val="18"/>
               </w:rPr>
+              <w:lastRenderedPageBreak/>
               <w:t>style.css</w:t>
             </w:r>
           </w:p>
@@ -3744,7 +4000,17 @@
                 <w:sz w:val="18"/>
                 <w:szCs w:val="18"/>
               </w:rPr>
-              <w:t xml:space="preserve">Shared stylesheet </w:t>
+              <w:t xml:space="preserve">Shared </w:t>
+            </w:r>
+            <w:proofErr w:type="gramStart"/>
+            <w:r>
+              <w:rPr>
+                <w:rFonts w:ascii="Arial" w:eastAsia="Arial" w:hAnsi="Arial" w:cs="Arial"/>
+                <w:color w:val="000000"/>
+                <w:sz w:val="18"/>
+                <w:szCs w:val="18"/>
+              </w:rPr>
+              <w:t xml:space="preserve">stylesheet </w:t>
             </w:r>
             <w:r>
               <w:rPr>
@@ -3755,6 +4021,7 @@
               </w:rPr>
               <w:t>,</w:t>
             </w:r>
+            <w:proofErr w:type="gramEnd"/>
             <w:r>
               <w:rPr>
                 <w:rFonts w:ascii="Arial" w:eastAsia="Arial" w:hAnsi="Arial" w:cs="Arial"/>
@@ -4093,7 +4360,6 @@
                 <w:sz w:val="18"/>
                 <w:szCs w:val="18"/>
               </w:rPr>
-              <w:lastRenderedPageBreak/>
               <w:t>Assignment_04_Spring2026.docx</w:t>
             </w:r>
           </w:p>
@@ -4164,7 +4430,15 @@
           <w:rFonts w:ascii="Arial" w:eastAsia="Arial" w:hAnsi="Arial" w:cs="Arial"/>
           <w:color w:val="000000"/>
         </w:rPr>
-        <w:t xml:space="preserve">The Team Lead (TL) is responsible for creating all secrets listed below. The TL is the repository admin and the credentials in use </w:t>
+        <w:t xml:space="preserve">The Team Lead (TL) is responsible for creating all secrets listed below. The TL is the repository admin and the credentials in </w:t>
+      </w:r>
+      <w:proofErr w:type="gramStart"/>
+      <w:r>
+        <w:rPr>
+          <w:rFonts w:ascii="Arial" w:eastAsia="Arial" w:hAnsi="Arial" w:cs="Arial"/>
+          <w:color w:val="000000"/>
+        </w:rPr>
+        <w:t xml:space="preserve">use </w:t>
       </w:r>
       <w:r>
         <w:rPr>
@@ -4173,12 +4447,21 @@
         </w:rPr>
         <w:t>,</w:t>
       </w:r>
-      <w:r>
-        <w:rPr>
-          <w:rFonts w:ascii="Arial" w:eastAsia="Arial" w:hAnsi="Arial" w:cs="Arial"/>
-          <w:color w:val="000000"/>
-        </w:rPr>
-        <w:t xml:space="preserve"> Docker Hub and Render </w:t>
+      <w:proofErr w:type="gramEnd"/>
+      <w:r>
+        <w:rPr>
+          <w:rFonts w:ascii="Arial" w:eastAsia="Arial" w:hAnsi="Arial" w:cs="Arial"/>
+          <w:color w:val="000000"/>
+        </w:rPr>
+        <w:t xml:space="preserve"> Docker Hub and </w:t>
+      </w:r>
+      <w:proofErr w:type="gramStart"/>
+      <w:r>
+        <w:rPr>
+          <w:rFonts w:ascii="Arial" w:eastAsia="Arial" w:hAnsi="Arial" w:cs="Arial"/>
+          <w:color w:val="000000"/>
+        </w:rPr>
+        <w:t xml:space="preserve">Render </w:t>
       </w:r>
       <w:r>
         <w:rPr>
@@ -4187,6 +4470,7 @@
         </w:rPr>
         <w:t>,</w:t>
       </w:r>
+      <w:proofErr w:type="gramEnd"/>
       <w:r>
         <w:rPr>
           <w:rFonts w:ascii="Arial" w:eastAsia="Arial" w:hAnsi="Arial" w:cs="Arial"/>
@@ -4603,7 +4887,17 @@
                 <w:sz w:val="18"/>
                 <w:szCs w:val="18"/>
               </w:rPr>
-              <w:t xml:space="preserve">Team Lead's Docker Hub Personal Access Token (PAT) </w:t>
+              <w:t>Team Lead's Docker Hub Personal Access Token (PAT</w:t>
+            </w:r>
+            <w:proofErr w:type="gramStart"/>
+            <w:r>
+              <w:rPr>
+                <w:rFonts w:ascii="Arial" w:eastAsia="Arial" w:hAnsi="Arial" w:cs="Arial"/>
+                <w:color w:val="000000"/>
+                <w:sz w:val="18"/>
+                <w:szCs w:val="18"/>
+              </w:rPr>
+              <w:t xml:space="preserve">) </w:t>
             </w:r>
             <w:r>
               <w:rPr>
@@ -4614,6 +4908,7 @@
               </w:rPr>
               <w:t>,</w:t>
             </w:r>
+            <w:proofErr w:type="gramEnd"/>
             <w:r>
               <w:rPr>
                 <w:rFonts w:ascii="Arial" w:eastAsia="Arial" w:hAnsi="Arial" w:cs="Arial"/>
@@ -4780,7 +5075,31 @@
           <w:sz w:val="28"/>
           <w:szCs w:val="28"/>
         </w:rPr>
-        <w:t>CI PIPELINE REQUIREMENTS  (.</w:t>
+        <w:t xml:space="preserve">CI PIPELINE </w:t>
+      </w:r>
+      <w:proofErr w:type="gramStart"/>
+      <w:r>
+        <w:rPr>
+          <w:rFonts w:ascii="Arial" w:eastAsia="Arial" w:hAnsi="Arial" w:cs="Arial"/>
+          <w:b/>
+          <w:bCs/>
+          <w:color w:val="1F3864"/>
+          <w:sz w:val="28"/>
+          <w:szCs w:val="28"/>
+        </w:rPr>
+        <w:t>REQUIREMENTS  (</w:t>
+      </w:r>
+      <w:proofErr w:type="gramEnd"/>
+      <w:r>
+        <w:rPr>
+          <w:rFonts w:ascii="Arial" w:eastAsia="Arial" w:hAnsi="Arial" w:cs="Arial"/>
+          <w:b/>
+          <w:bCs/>
+          <w:color w:val="1F3864"/>
+          <w:sz w:val="28"/>
+          <w:szCs w:val="28"/>
+        </w:rPr>
+        <w:t>.</w:t>
       </w:r>
       <w:proofErr w:type="spellStart"/>
       <w:r>
@@ -4983,7 +5302,15 @@
           <w:rFonts w:ascii="Arial" w:eastAsia="Arial" w:hAnsi="Arial" w:cs="Arial"/>
           <w:color w:val="000000"/>
         </w:rPr>
-        <w:t xml:space="preserve">Step 4 – Tag Image: Tag the image using a meaningful strategy </w:t>
+        <w:t xml:space="preserve">Step 4 – Tag Image: Tag the image using a meaningful </w:t>
+      </w:r>
+      <w:proofErr w:type="gramStart"/>
+      <w:r>
+        <w:rPr>
+          <w:rFonts w:ascii="Arial" w:eastAsia="Arial" w:hAnsi="Arial" w:cs="Arial"/>
+          <w:color w:val="000000"/>
+        </w:rPr>
+        <w:t xml:space="preserve">strategy </w:t>
       </w:r>
       <w:r>
         <w:rPr>
@@ -4992,6 +5319,7 @@
         </w:rPr>
         <w:t>,</w:t>
       </w:r>
+      <w:proofErr w:type="gramEnd"/>
       <w:r>
         <w:rPr>
           <w:rFonts w:ascii="Arial" w:eastAsia="Arial" w:hAnsi="Arial" w:cs="Arial"/>
@@ -5030,6 +5358,7 @@
           <w:rFonts w:ascii="Arial" w:eastAsia="Arial" w:hAnsi="Arial" w:cs="Arial"/>
           <w:color w:val="000000"/>
         </w:rPr>
+        <w:lastRenderedPageBreak/>
         <w:t>Step 5 – Push Image: Push the tagged image to Docker Hub.</w:t>
       </w:r>
     </w:p>
@@ -5082,7 +5411,6 @@
           <w:rFonts w:ascii="Arial" w:eastAsia="Arial" w:hAnsi="Arial" w:cs="Arial"/>
           <w:color w:val="000000"/>
         </w:rPr>
-        <w:lastRenderedPageBreak/>
         <w:t xml:space="preserve">The CI status check must appear as a required check in the Branch Protection Rules on </w:t>
       </w:r>
       <w:r>
@@ -5121,7 +5449,31 @@
           <w:sz w:val="28"/>
           <w:szCs w:val="28"/>
         </w:rPr>
-        <w:t>CD PIPELINE REQUIREMENTS  (.</w:t>
+        <w:t xml:space="preserve">CD PIPELINE </w:t>
+      </w:r>
+      <w:proofErr w:type="gramStart"/>
+      <w:r>
+        <w:rPr>
+          <w:rFonts w:ascii="Arial" w:eastAsia="Arial" w:hAnsi="Arial" w:cs="Arial"/>
+          <w:b/>
+          <w:bCs/>
+          <w:color w:val="1F3864"/>
+          <w:sz w:val="28"/>
+          <w:szCs w:val="28"/>
+        </w:rPr>
+        <w:t>REQUIREMENTS  (</w:t>
+      </w:r>
+      <w:proofErr w:type="gramEnd"/>
+      <w:r>
+        <w:rPr>
+          <w:rFonts w:ascii="Arial" w:eastAsia="Arial" w:hAnsi="Arial" w:cs="Arial"/>
+          <w:b/>
+          <w:bCs/>
+          <w:color w:val="1F3864"/>
+          <w:sz w:val="28"/>
+          <w:szCs w:val="28"/>
+        </w:rPr>
+        <w:t>.</w:t>
       </w:r>
       <w:proofErr w:type="spellStart"/>
       <w:r>
@@ -5289,7 +5641,23 @@
           <w:rFonts w:ascii="Arial" w:eastAsia="Arial" w:hAnsi="Arial" w:cs="Arial"/>
           <w:color w:val="000000"/>
         </w:rPr>
-        <w:t>Step 3 – Deploy: Send an HTTP POST request to the Render deploy hook URL using curl:</w:t>
+        <w:t xml:space="preserve">Step 3 – Deploy: Send an HTTP POST request to the Render </w:t>
+      </w:r>
+      <w:proofErr w:type="gramStart"/>
+      <w:r>
+        <w:rPr>
+          <w:rFonts w:ascii="Arial" w:eastAsia="Arial" w:hAnsi="Arial" w:cs="Arial"/>
+          <w:color w:val="000000"/>
+        </w:rPr>
+        <w:t>deploy</w:t>
+      </w:r>
+      <w:proofErr w:type="gramEnd"/>
+      <w:r>
+        <w:rPr>
+          <w:rFonts w:ascii="Arial" w:eastAsia="Arial" w:hAnsi="Arial" w:cs="Arial"/>
+          <w:color w:val="000000"/>
+        </w:rPr>
+        <w:t xml:space="preserve"> hook URL using curl:</w:t>
       </w:r>
     </w:p>
     <w:p>
@@ -5307,25 +5675,61 @@
           <w:sz w:val="19"/>
           <w:szCs w:val="19"/>
         </w:rPr>
-        <w:t xml:space="preserve">curl -X POST ${{ </w:t>
-      </w:r>
-      <w:proofErr w:type="spellStart"/>
+        <w:t>curl -X POST $</w:t>
+      </w:r>
+      <w:proofErr w:type="gramStart"/>
       <w:r>
         <w:rPr>
           <w:rFonts w:ascii="Arial" w:eastAsia="Arial" w:hAnsi="Arial" w:cs="Arial"/>
           <w:sz w:val="19"/>
           <w:szCs w:val="19"/>
         </w:rPr>
-        <w:t>secrets.RENDER_DEPLOY_HOOK_URL</w:t>
-      </w:r>
-      <w:proofErr w:type="spellEnd"/>
+        <w:t xml:space="preserve">{{ </w:t>
+      </w:r>
+      <w:proofErr w:type="spellStart"/>
       <w:r>
         <w:rPr>
           <w:rFonts w:ascii="Arial" w:eastAsia="Arial" w:hAnsi="Arial" w:cs="Arial"/>
           <w:sz w:val="19"/>
           <w:szCs w:val="19"/>
         </w:rPr>
-        <w:t xml:space="preserve"> }}</w:t>
+        <w:t>secrets</w:t>
+      </w:r>
+      <w:proofErr w:type="gramEnd"/>
+      <w:r>
+        <w:rPr>
+          <w:rFonts w:ascii="Arial" w:eastAsia="Arial" w:hAnsi="Arial" w:cs="Arial"/>
+          <w:sz w:val="19"/>
+          <w:szCs w:val="19"/>
+        </w:rPr>
+        <w:t>.RENDER_DEPLOY_HOOK_</w:t>
+      </w:r>
+      <w:proofErr w:type="gramStart"/>
+      <w:r>
+        <w:rPr>
+          <w:rFonts w:ascii="Arial" w:eastAsia="Arial" w:hAnsi="Arial" w:cs="Arial"/>
+          <w:sz w:val="19"/>
+          <w:szCs w:val="19"/>
+        </w:rPr>
+        <w:t>URL</w:t>
+      </w:r>
+      <w:proofErr w:type="spellEnd"/>
+      <w:r>
+        <w:rPr>
+          <w:rFonts w:ascii="Arial" w:eastAsia="Arial" w:hAnsi="Arial" w:cs="Arial"/>
+          <w:sz w:val="19"/>
+          <w:szCs w:val="19"/>
+        </w:rPr>
+        <w:t xml:space="preserve"> }</w:t>
+      </w:r>
+      <w:proofErr w:type="gramEnd"/>
+      <w:r>
+        <w:rPr>
+          <w:rFonts w:ascii="Arial" w:eastAsia="Arial" w:hAnsi="Arial" w:cs="Arial"/>
+          <w:sz w:val="19"/>
+          <w:szCs w:val="19"/>
+        </w:rPr>
+        <w:t>}</w:t>
       </w:r>
     </w:p>
     <w:p>
@@ -5394,7 +5798,15 @@
           <w:rFonts w:ascii="Arial" w:eastAsia="Arial" w:hAnsi="Arial" w:cs="Arial"/>
           <w:color w:val="000000"/>
         </w:rPr>
-        <w:t xml:space="preserve">The job must NOT contain any Docker build or push steps </w:t>
+        <w:t xml:space="preserve">The job must NOT contain any Docker build or push </w:t>
+      </w:r>
+      <w:proofErr w:type="gramStart"/>
+      <w:r>
+        <w:rPr>
+          <w:rFonts w:ascii="Arial" w:eastAsia="Arial" w:hAnsi="Arial" w:cs="Arial"/>
+          <w:color w:val="000000"/>
+        </w:rPr>
+        <w:t xml:space="preserve">steps </w:t>
       </w:r>
       <w:r>
         <w:rPr>
@@ -5403,6 +5815,7 @@
         </w:rPr>
         <w:t>,</w:t>
       </w:r>
+      <w:proofErr w:type="gramEnd"/>
       <w:r>
         <w:rPr>
           <w:rFonts w:ascii="Arial" w:eastAsia="Arial" w:hAnsi="Arial" w:cs="Arial"/>
@@ -5904,7 +6317,15 @@
           <w:rFonts w:ascii="Arial" w:eastAsia="Arial" w:hAnsi="Arial" w:cs="Arial"/>
           <w:color w:val="000000"/>
         </w:rPr>
-        <w:t xml:space="preserve">Team Lead: Set up the initial repository structure </w:t>
+        <w:t xml:space="preserve">Team Lead: Set up the initial repository </w:t>
+      </w:r>
+      <w:proofErr w:type="gramStart"/>
+      <w:r>
+        <w:rPr>
+          <w:rFonts w:ascii="Arial" w:eastAsia="Arial" w:hAnsi="Arial" w:cs="Arial"/>
+          <w:color w:val="000000"/>
+        </w:rPr>
+        <w:t xml:space="preserve">structure </w:t>
       </w:r>
       <w:r>
         <w:rPr>
@@ -5913,6 +6334,7 @@
         </w:rPr>
         <w:t>,</w:t>
       </w:r>
+      <w:proofErr w:type="gramEnd"/>
       <w:r>
         <w:rPr>
           <w:rFonts w:ascii="Arial" w:eastAsia="Arial" w:hAnsi="Arial" w:cs="Arial"/>
@@ -5965,7 +6387,15 @@
           <w:rFonts w:ascii="Arial" w:eastAsia="Arial" w:hAnsi="Arial" w:cs="Arial"/>
           <w:color w:val="000000"/>
         </w:rPr>
-        <w:t xml:space="preserve">Commit the Assignment 04 question paper (.docx) to the root of the repository. Every team member must fill in their details </w:t>
+        <w:t xml:space="preserve">Commit the Assignment 04 question paper (.docx) to the root of the repository. Every team member must fill in their </w:t>
+      </w:r>
+      <w:proofErr w:type="gramStart"/>
+      <w:r>
+        <w:rPr>
+          <w:rFonts w:ascii="Arial" w:eastAsia="Arial" w:hAnsi="Arial" w:cs="Arial"/>
+          <w:color w:val="000000"/>
+        </w:rPr>
+        <w:t xml:space="preserve">details </w:t>
       </w:r>
       <w:r>
         <w:rPr>
@@ -5974,12 +6404,21 @@
         </w:rPr>
         <w:t>,</w:t>
       </w:r>
-      <w:r>
-        <w:rPr>
-          <w:rFonts w:ascii="Arial" w:eastAsia="Arial" w:hAnsi="Arial" w:cs="Arial"/>
-          <w:color w:val="000000"/>
-        </w:rPr>
-        <w:t xml:space="preserve"> including their Assigned Page </w:t>
+      <w:proofErr w:type="gramEnd"/>
+      <w:r>
+        <w:rPr>
+          <w:rFonts w:ascii="Arial" w:eastAsia="Arial" w:hAnsi="Arial" w:cs="Arial"/>
+          <w:color w:val="000000"/>
+        </w:rPr>
+        <w:t xml:space="preserve"> including their Assigned </w:t>
+      </w:r>
+      <w:proofErr w:type="gramStart"/>
+      <w:r>
+        <w:rPr>
+          <w:rFonts w:ascii="Arial" w:eastAsia="Arial" w:hAnsi="Arial" w:cs="Arial"/>
+          <w:color w:val="000000"/>
+        </w:rPr>
+        <w:t xml:space="preserve">Page </w:t>
       </w:r>
       <w:r>
         <w:rPr>
@@ -5988,6 +6427,7 @@
         </w:rPr>
         <w:t>,</w:t>
       </w:r>
+      <w:proofErr w:type="gramEnd"/>
       <w:r>
         <w:rPr>
           <w:rFonts w:ascii="Arial" w:eastAsia="Arial" w:hAnsi="Arial" w:cs="Arial"/>
@@ -6024,7 +6464,15 @@
           <w:rFonts w:ascii="Arial" w:eastAsia="Arial" w:hAnsi="Arial" w:cs="Arial"/>
           <w:color w:val="000000"/>
         </w:rPr>
-        <w:t xml:space="preserve"> and configure all three secrets </w:t>
+        <w:t xml:space="preserve"> and configure all three </w:t>
+      </w:r>
+      <w:proofErr w:type="gramStart"/>
+      <w:r>
+        <w:rPr>
+          <w:rFonts w:ascii="Arial" w:eastAsia="Arial" w:hAnsi="Arial" w:cs="Arial"/>
+          <w:color w:val="000000"/>
+        </w:rPr>
+        <w:t xml:space="preserve">secrets </w:t>
       </w:r>
       <w:r>
         <w:rPr>
@@ -6033,6 +6481,7 @@
         </w:rPr>
         <w:t>,</w:t>
       </w:r>
+      <w:proofErr w:type="gramEnd"/>
       <w:r>
         <w:rPr>
           <w:rFonts w:ascii="Arial" w:eastAsia="Arial" w:hAnsi="Arial" w:cs="Arial"/>
@@ -6100,7 +6549,16 @@
           <w:rFonts w:ascii="Arial" w:eastAsia="Arial" w:hAnsi="Arial" w:cs="Arial"/>
           <w:color w:val="000000"/>
         </w:rPr>
-        <w:t>Create the CI workflow at .</w:t>
+        <w:lastRenderedPageBreak/>
+        <w:t xml:space="preserve">Create the CI workflow at </w:t>
+      </w:r>
+      <w:proofErr w:type="gramStart"/>
+      <w:r>
+        <w:rPr>
+          <w:rFonts w:ascii="Arial" w:eastAsia="Arial" w:hAnsi="Arial" w:cs="Arial"/>
+          <w:color w:val="000000"/>
+        </w:rPr>
+        <w:t>.</w:t>
       </w:r>
       <w:proofErr w:type="spellStart"/>
       <w:r>
@@ -6141,6 +6599,7 @@
         </w:rPr>
         <w:t>,</w:t>
       </w:r>
+      <w:proofErr w:type="gramEnd"/>
       <w:r>
         <w:rPr>
           <w:rFonts w:ascii="Arial" w:eastAsia="Arial" w:hAnsi="Arial" w:cs="Arial"/>
@@ -6193,7 +6652,15 @@
           <w:rFonts w:ascii="Arial" w:eastAsia="Arial" w:hAnsi="Arial" w:cs="Arial"/>
           <w:color w:val="000000"/>
         </w:rPr>
-        <w:t>Create the CD workflow at .</w:t>
+        <w:t xml:space="preserve">Create the CD workflow at </w:t>
+      </w:r>
+      <w:proofErr w:type="gramStart"/>
+      <w:r>
+        <w:rPr>
+          <w:rFonts w:ascii="Arial" w:eastAsia="Arial" w:hAnsi="Arial" w:cs="Arial"/>
+          <w:color w:val="000000"/>
+        </w:rPr>
+        <w:t>.</w:t>
       </w:r>
       <w:proofErr w:type="spellStart"/>
       <w:r>
@@ -6234,6 +6701,7 @@
         </w:rPr>
         <w:t>,</w:t>
       </w:r>
+      <w:proofErr w:type="gramEnd"/>
       <w:r>
         <w:rPr>
           <w:rFonts w:ascii="Arial" w:eastAsia="Arial" w:hAnsi="Arial" w:cs="Arial"/>
@@ -6324,7 +6792,6 @@
           <w:sz w:val="19"/>
           <w:szCs w:val="19"/>
         </w:rPr>
-        <w:lastRenderedPageBreak/>
         <w:t>Build the assigned HTML page with proper content and link it to style.css</w:t>
       </w:r>
     </w:p>
@@ -6369,15 +6836,16 @@
           <w:sz w:val="19"/>
           <w:szCs w:val="19"/>
         </w:rPr>
-        <w:t>“develop”</w:t>
-      </w:r>
+        <w:t>“develop</w:t>
+      </w:r>
+      <w:proofErr w:type="gramStart"/>
       <w:r>
         <w:rPr>
           <w:rFonts w:ascii="Arial" w:eastAsia="Arial" w:hAnsi="Arial" w:cs="Arial"/>
           <w:sz w:val="19"/>
           <w:szCs w:val="19"/>
         </w:rPr>
-        <w:t xml:space="preserve"> </w:t>
+        <w:t>”</w:t>
       </w:r>
       <w:r>
         <w:rPr>
@@ -6385,8 +6853,17 @@
           <w:sz w:val="19"/>
           <w:szCs w:val="19"/>
         </w:rPr>
+        <w:t xml:space="preserve"> </w:t>
+      </w:r>
+      <w:r>
+        <w:rPr>
+          <w:rFonts w:ascii="Arial" w:eastAsia="Arial" w:hAnsi="Arial" w:cs="Arial"/>
+          <w:sz w:val="19"/>
+          <w:szCs w:val="19"/>
+        </w:rPr>
         <w:t>,</w:t>
       </w:r>
+      <w:proofErr w:type="gramEnd"/>
       <w:r>
         <w:rPr>
           <w:rFonts w:ascii="Arial" w:eastAsia="Arial" w:hAnsi="Arial" w:cs="Arial"/>
@@ -6411,16 +6888,26 @@
           <w:sz w:val="19"/>
           <w:szCs w:val="19"/>
         </w:rPr>
-        <w:t xml:space="preserve">Request a review; after approval the Team Lead merges the PR </w:t>
-      </w:r>
+        <w:t xml:space="preserve">Request a review; after approval the Team Lead merges the </w:t>
+      </w:r>
+      <w:proofErr w:type="gramStart"/>
       <w:r>
         <w:rPr>
           <w:rFonts w:ascii="Arial" w:eastAsia="Arial" w:hAnsi="Arial" w:cs="Arial"/>
           <w:sz w:val="19"/>
           <w:szCs w:val="19"/>
         </w:rPr>
+        <w:t xml:space="preserve">PR </w:t>
+      </w:r>
+      <w:r>
+        <w:rPr>
+          <w:rFonts w:ascii="Arial" w:eastAsia="Arial" w:hAnsi="Arial" w:cs="Arial"/>
+          <w:sz w:val="19"/>
+          <w:szCs w:val="19"/>
+        </w:rPr>
         <w:t>,</w:t>
       </w:r>
+      <w:proofErr w:type="gramEnd"/>
       <w:r>
         <w:rPr>
           <w:rFonts w:ascii="Arial" w:eastAsia="Arial" w:hAnsi="Arial" w:cs="Arial"/>
@@ -6444,7 +6931,23 @@
           <w:rFonts w:ascii="Arial" w:eastAsia="Arial" w:hAnsi="Arial" w:cs="Arial"/>
           <w:color w:val="000000"/>
         </w:rPr>
-        <w:t xml:space="preserve">After all 5 PRs are merged, verify the live </w:t>
+        <w:t xml:space="preserve">After </w:t>
+      </w:r>
+      <w:proofErr w:type="gramStart"/>
+      <w:r>
+        <w:rPr>
+          <w:rFonts w:ascii="Arial" w:eastAsia="Arial" w:hAnsi="Arial" w:cs="Arial"/>
+          <w:color w:val="000000"/>
+        </w:rPr>
+        <w:t>all</w:t>
+      </w:r>
+      <w:proofErr w:type="gramEnd"/>
+      <w:r>
+        <w:rPr>
+          <w:rFonts w:ascii="Arial" w:eastAsia="Arial" w:hAnsi="Arial" w:cs="Arial"/>
+          <w:color w:val="000000"/>
+        </w:rPr>
+        <w:t xml:space="preserve"> 5 PRs are merged, verify the live </w:t>
       </w:r>
       <w:proofErr w:type="spellStart"/>
       <w:r>
@@ -8384,6 +8887,7 @@
                 <w:sz w:val="18"/>
                 <w:szCs w:val="18"/>
               </w:rPr>
+              <w:lastRenderedPageBreak/>
               <w:t>13</w:t>
             </w:r>
           </w:p>
@@ -8621,7 +9125,6 @@
                 <w:sz w:val="18"/>
                 <w:szCs w:val="18"/>
               </w:rPr>
-              <w:lastRenderedPageBreak/>
               <w:t>15</w:t>
             </w:r>
           </w:p>
@@ -9177,7 +9680,15 @@
           <w:rFonts w:ascii="Arial" w:eastAsia="Arial" w:hAnsi="Arial" w:cs="Arial"/>
           <w:color w:val="000000"/>
         </w:rPr>
-        <w:t xml:space="preserve">Screenshot 2: Each member's CI workflow run triggered by their individual PR </w:t>
+        <w:t xml:space="preserve">Screenshot 2: Each member's CI workflow run triggered by their individual </w:t>
+      </w:r>
+      <w:proofErr w:type="gramStart"/>
+      <w:r>
+        <w:rPr>
+          <w:rFonts w:ascii="Arial" w:eastAsia="Arial" w:hAnsi="Arial" w:cs="Arial"/>
+          <w:color w:val="000000"/>
+        </w:rPr>
+        <w:t xml:space="preserve">PR </w:t>
       </w:r>
       <w:r>
         <w:rPr>
@@ -9186,6 +9697,7 @@
         </w:rPr>
         <w:t>,</w:t>
       </w:r>
+      <w:proofErr w:type="gramEnd"/>
       <w:r>
         <w:rPr>
           <w:rFonts w:ascii="Arial" w:eastAsia="Arial" w:hAnsi="Arial" w:cs="Arial"/>
@@ -9232,7 +9744,15 @@
           <w:rFonts w:ascii="Arial" w:eastAsia="Arial" w:hAnsi="Arial" w:cs="Arial"/>
           <w:color w:val="000000"/>
         </w:rPr>
-        <w:t>“develop”</w:t>
+        <w:t>“develop</w:t>
+      </w:r>
+      <w:proofErr w:type="gramStart"/>
+      <w:r>
+        <w:rPr>
+          <w:rFonts w:ascii="Arial" w:eastAsia="Arial" w:hAnsi="Arial" w:cs="Arial"/>
+          <w:color w:val="000000"/>
+        </w:rPr>
+        <w:t>”</w:t>
       </w:r>
       <w:r>
         <w:rPr>
@@ -9248,6 +9768,7 @@
         </w:rPr>
         <w:t>,</w:t>
       </w:r>
+      <w:proofErr w:type="gramEnd"/>
       <w:r>
         <w:rPr>
           <w:rFonts w:ascii="Arial" w:eastAsia="Arial" w:hAnsi="Arial" w:cs="Arial"/>
@@ -9378,8 +9899,8 @@
         <w:tblLook w:val="0000" w:firstRow="0" w:lastRow="0" w:firstColumn="0" w:lastColumn="0" w:noHBand="0" w:noVBand="0"/>
       </w:tblPr>
       <w:tblGrid>
-        <w:gridCol w:w="3200"/>
-        <w:gridCol w:w="6160"/>
+        <w:gridCol w:w="1359"/>
+        <w:gridCol w:w="8705"/>
       </w:tblGrid>
       <w:tr>
         <w:tc>
@@ -9476,6 +9997,7 @@
                 <w:sz w:val="18"/>
                 <w:szCs w:val="18"/>
               </w:rPr>
+              <w:lastRenderedPageBreak/>
               <w:t xml:space="preserve">GitHub </w:t>
             </w:r>
             <w:r>
@@ -9520,6 +10042,58 @@
             </w:tcMar>
             <w:vAlign w:val="center"/>
           </w:tcPr>
+          <w:p>
+            <w:r>
+              <w:drawing>
+                <wp:inline distT="0" distB="0" distL="0" distR="0" wp14:anchorId="57DC5DBC" wp14:editId="73F97ED3">
+                  <wp:extent cx="5296859" cy="2813957"/>
+                  <wp:effectExtent l="0" t="0" r="0" b="5715"/>
+                  <wp:docPr id="1054707184" name="Picture 2"/>
+                  <wp:cNvGraphicFramePr>
+                    <a:graphicFrameLocks xmlns:a="http://schemas.openxmlformats.org/drawingml/2006/main" noChangeAspect="1"/>
+                  </wp:cNvGraphicFramePr>
+                  <a:graphic xmlns:a="http://schemas.openxmlformats.org/drawingml/2006/main">
+                    <a:graphicData uri="http://schemas.openxmlformats.org/drawingml/2006/picture">
+                      <pic:pic xmlns:pic="http://schemas.openxmlformats.org/drawingml/2006/picture">
+                        <pic:nvPicPr>
+                          <pic:cNvPr id="0" name="Picture 6"/>
+                          <pic:cNvPicPr>
+                            <a:picLocks noChangeAspect="1" noChangeArrowheads="1"/>
+                          </pic:cNvPicPr>
+                        </pic:nvPicPr>
+                        <pic:blipFill>
+                          <a:blip r:embed="rId7" cstate="print">
+                            <a:extLst>
+                              <a:ext uri="{28A0092B-C50C-407E-A947-70E740481C1C}">
+                                <a14:useLocalDpi xmlns:a14="http://schemas.microsoft.com/office/drawing/2010/main" val="0"/>
+                              </a:ext>
+                            </a:extLst>
+                          </a:blip>
+                          <a:srcRect/>
+                          <a:stretch>
+                            <a:fillRect/>
+                          </a:stretch>
+                        </pic:blipFill>
+                        <pic:spPr bwMode="auto">
+                          <a:xfrm>
+                            <a:off x="0" y="0"/>
+                            <a:ext cx="5332955" cy="2833133"/>
+                          </a:xfrm>
+                          <a:prstGeom prst="rect">
+                            <a:avLst/>
+                          </a:prstGeom>
+                          <a:noFill/>
+                          <a:ln>
+                            <a:noFill/>
+                          </a:ln>
+                        </pic:spPr>
+                      </pic:pic>
+                    </a:graphicData>
+                  </a:graphic>
+                </wp:inline>
+              </w:drawing>
+            </w:r>
+          </w:p>
           <w:p/>
         </w:tc>
       </w:tr>
@@ -9574,7 +10148,217 @@
             </w:tcMar>
             <w:vAlign w:val="center"/>
           </w:tcPr>
+          <w:p>
+            <w:r>
+              <w:drawing>
+                <wp:inline distT="0" distB="0" distL="0" distR="0" wp14:anchorId="2C98AFC0" wp14:editId="527E3DE9">
+                  <wp:extent cx="5368581" cy="2852057"/>
+                  <wp:effectExtent l="0" t="0" r="3810" b="5715"/>
+                  <wp:docPr id="891094670" name="Picture 1"/>
+                  <wp:cNvGraphicFramePr>
+                    <a:graphicFrameLocks xmlns:a="http://schemas.openxmlformats.org/drawingml/2006/main" noChangeAspect="1"/>
+                  </wp:cNvGraphicFramePr>
+                  <a:graphic xmlns:a="http://schemas.openxmlformats.org/drawingml/2006/main">
+                    <a:graphicData uri="http://schemas.openxmlformats.org/drawingml/2006/picture">
+                      <pic:pic xmlns:pic="http://schemas.openxmlformats.org/drawingml/2006/picture">
+                        <pic:nvPicPr>
+                          <pic:cNvPr id="891094670" name=""/>
+                          <pic:cNvPicPr/>
+                        </pic:nvPicPr>
+                        <pic:blipFill>
+                          <a:blip r:embed="rId8"/>
+                          <a:stretch>
+                            <a:fillRect/>
+                          </a:stretch>
+                        </pic:blipFill>
+                        <pic:spPr>
+                          <a:xfrm>
+                            <a:off x="0" y="0"/>
+                            <a:ext cx="5376510" cy="2856269"/>
+                          </a:xfrm>
+                          <a:prstGeom prst="rect">
+                            <a:avLst/>
+                          </a:prstGeom>
+                        </pic:spPr>
+                      </pic:pic>
+                    </a:graphicData>
+                  </a:graphic>
+                </wp:inline>
+              </w:drawing>
+            </w:r>
+          </w:p>
           <w:p/>
+          <w:p/>
+          <w:p>
+            <w:r>
+              <w:rPr>
+                <w:noProof/>
+              </w:rPr>
+              <w:lastRenderedPageBreak/>
+              <w:drawing>
+                <wp:inline distT="0" distB="0" distL="0" distR="0" wp14:anchorId="21DF4391" wp14:editId="781FB897">
+                  <wp:extent cx="5358334" cy="2846615"/>
+                  <wp:effectExtent l="0" t="0" r="0" b="0"/>
+                  <wp:docPr id="1336274290" name="Picture 3"/>
+                  <wp:cNvGraphicFramePr>
+                    <a:graphicFrameLocks xmlns:a="http://schemas.openxmlformats.org/drawingml/2006/main" noChangeAspect="1"/>
+                  </wp:cNvGraphicFramePr>
+                  <a:graphic xmlns:a="http://schemas.openxmlformats.org/drawingml/2006/main">
+                    <a:graphicData uri="http://schemas.openxmlformats.org/drawingml/2006/picture">
+                      <pic:pic xmlns:pic="http://schemas.openxmlformats.org/drawingml/2006/picture">
+                        <pic:nvPicPr>
+                          <pic:cNvPr id="0" name="Picture 8"/>
+                          <pic:cNvPicPr>
+                            <a:picLocks noChangeAspect="1" noChangeArrowheads="1"/>
+                          </pic:cNvPicPr>
+                        </pic:nvPicPr>
+                        <pic:blipFill>
+                          <a:blip r:embed="rId9" cstate="print">
+                            <a:extLst>
+                              <a:ext uri="{28A0092B-C50C-407E-A947-70E740481C1C}">
+                                <a14:useLocalDpi xmlns:a14="http://schemas.microsoft.com/office/drawing/2010/main" val="0"/>
+                              </a:ext>
+                            </a:extLst>
+                          </a:blip>
+                          <a:srcRect/>
+                          <a:stretch>
+                            <a:fillRect/>
+                          </a:stretch>
+                        </pic:blipFill>
+                        <pic:spPr bwMode="auto">
+                          <a:xfrm>
+                            <a:off x="0" y="0"/>
+                            <a:ext cx="5384383" cy="2860454"/>
+                          </a:xfrm>
+                          <a:prstGeom prst="rect">
+                            <a:avLst/>
+                          </a:prstGeom>
+                          <a:noFill/>
+                          <a:ln>
+                            <a:noFill/>
+                          </a:ln>
+                        </pic:spPr>
+                      </pic:pic>
+                    </a:graphicData>
+                  </a:graphic>
+                </wp:inline>
+              </w:drawing>
+            </w:r>
+          </w:p>
+          <w:p/>
+          <w:p/>
+          <w:p>
+            <w:r>
+              <w:rPr>
+                <w:noProof/>
+              </w:rPr>
+              <w:drawing>
+                <wp:inline distT="0" distB="0" distL="0" distR="0" wp14:anchorId="2B28E6CA" wp14:editId="4475D957">
+                  <wp:extent cx="5295900" cy="2813447"/>
+                  <wp:effectExtent l="0" t="0" r="0" b="6350"/>
+                  <wp:docPr id="1557066882" name="Picture 4"/>
+                  <wp:cNvGraphicFramePr>
+                    <a:graphicFrameLocks xmlns:a="http://schemas.openxmlformats.org/drawingml/2006/main" noChangeAspect="1"/>
+                  </wp:cNvGraphicFramePr>
+                  <a:graphic xmlns:a="http://schemas.openxmlformats.org/drawingml/2006/main">
+                    <a:graphicData uri="http://schemas.openxmlformats.org/drawingml/2006/picture">
+                      <pic:pic xmlns:pic="http://schemas.openxmlformats.org/drawingml/2006/picture">
+                        <pic:nvPicPr>
+                          <pic:cNvPr id="0" name="Picture 10"/>
+                          <pic:cNvPicPr>
+                            <a:picLocks noChangeAspect="1" noChangeArrowheads="1"/>
+                          </pic:cNvPicPr>
+                        </pic:nvPicPr>
+                        <pic:blipFill>
+                          <a:blip r:embed="rId10" cstate="print">
+                            <a:extLst>
+                              <a:ext uri="{28A0092B-C50C-407E-A947-70E740481C1C}">
+                                <a14:useLocalDpi xmlns:a14="http://schemas.microsoft.com/office/drawing/2010/main" val="0"/>
+                              </a:ext>
+                            </a:extLst>
+                          </a:blip>
+                          <a:srcRect/>
+                          <a:stretch>
+                            <a:fillRect/>
+                          </a:stretch>
+                        </pic:blipFill>
+                        <pic:spPr bwMode="auto">
+                          <a:xfrm>
+                            <a:off x="0" y="0"/>
+                            <a:ext cx="5329531" cy="2831314"/>
+                          </a:xfrm>
+                          <a:prstGeom prst="rect">
+                            <a:avLst/>
+                          </a:prstGeom>
+                          <a:noFill/>
+                          <a:ln>
+                            <a:noFill/>
+                          </a:ln>
+                        </pic:spPr>
+                      </pic:pic>
+                    </a:graphicData>
+                  </a:graphic>
+                </wp:inline>
+              </w:drawing>
+            </w:r>
+          </w:p>
+          <w:p/>
+          <w:p>
+            <w:r>
+              <w:rPr>
+                <w:noProof/>
+              </w:rPr>
+              <w:lastRenderedPageBreak/>
+              <w:drawing>
+                <wp:inline distT="0" distB="0" distL="0" distR="0" wp14:anchorId="0106C431" wp14:editId="71938C2F">
+                  <wp:extent cx="5389069" cy="2862943"/>
+                  <wp:effectExtent l="0" t="0" r="2540" b="0"/>
+                  <wp:docPr id="25483925" name="Picture 5"/>
+                  <wp:cNvGraphicFramePr>
+                    <a:graphicFrameLocks xmlns:a="http://schemas.openxmlformats.org/drawingml/2006/main" noChangeAspect="1"/>
+                  </wp:cNvGraphicFramePr>
+                  <a:graphic xmlns:a="http://schemas.openxmlformats.org/drawingml/2006/main">
+                    <a:graphicData uri="http://schemas.openxmlformats.org/drawingml/2006/picture">
+                      <pic:pic xmlns:pic="http://schemas.openxmlformats.org/drawingml/2006/picture">
+                        <pic:nvPicPr>
+                          <pic:cNvPr id="0" name="Picture 12"/>
+                          <pic:cNvPicPr>
+                            <a:picLocks noChangeAspect="1" noChangeArrowheads="1"/>
+                          </pic:cNvPicPr>
+                        </pic:nvPicPr>
+                        <pic:blipFill>
+                          <a:blip r:embed="rId11" cstate="print">
+                            <a:extLst>
+                              <a:ext uri="{28A0092B-C50C-407E-A947-70E740481C1C}">
+                                <a14:useLocalDpi xmlns:a14="http://schemas.microsoft.com/office/drawing/2010/main" val="0"/>
+                              </a:ext>
+                            </a:extLst>
+                          </a:blip>
+                          <a:srcRect/>
+                          <a:stretch>
+                            <a:fillRect/>
+                          </a:stretch>
+                        </pic:blipFill>
+                        <pic:spPr bwMode="auto">
+                          <a:xfrm>
+                            <a:off x="0" y="0"/>
+                            <a:ext cx="5415533" cy="2877002"/>
+                          </a:xfrm>
+                          <a:prstGeom prst="rect">
+                            <a:avLst/>
+                          </a:prstGeom>
+                          <a:noFill/>
+                          <a:ln>
+                            <a:noFill/>
+                          </a:ln>
+                        </pic:spPr>
+                      </pic:pic>
+                    </a:graphicData>
+                  </a:graphic>
+                </wp:inline>
+              </w:drawing>
+            </w:r>
+          </w:p>
         </w:tc>
       </w:tr>
       <w:tr>
@@ -9606,6 +10390,7 @@
                 <w:sz w:val="18"/>
                 <w:szCs w:val="18"/>
               </w:rPr>
+              <w:lastRenderedPageBreak/>
               <w:t>Docker Hub – Pushed Image with Tags</w:t>
             </w:r>
           </w:p>
@@ -9628,7 +10413,61 @@
             </w:tcMar>
             <w:vAlign w:val="center"/>
           </w:tcPr>
-          <w:p/>
+          <w:p>
+            <w:r>
+              <w:rPr>
+                <w:noProof/>
+              </w:rPr>
+              <w:drawing>
+                <wp:inline distT="0" distB="0" distL="0" distR="0" wp14:anchorId="415035B8" wp14:editId="614825B7">
+                  <wp:extent cx="5170714" cy="2746942"/>
+                  <wp:effectExtent l="0" t="0" r="0" b="0"/>
+                  <wp:docPr id="1224815657" name="Picture 6"/>
+                  <wp:cNvGraphicFramePr>
+                    <a:graphicFrameLocks xmlns:a="http://schemas.openxmlformats.org/drawingml/2006/main" noChangeAspect="1"/>
+                  </wp:cNvGraphicFramePr>
+                  <a:graphic xmlns:a="http://schemas.openxmlformats.org/drawingml/2006/main">
+                    <a:graphicData uri="http://schemas.openxmlformats.org/drawingml/2006/picture">
+                      <pic:pic xmlns:pic="http://schemas.openxmlformats.org/drawingml/2006/picture">
+                        <pic:nvPicPr>
+                          <pic:cNvPr id="0" name="Picture 14"/>
+                          <pic:cNvPicPr>
+                            <a:picLocks noChangeAspect="1" noChangeArrowheads="1"/>
+                          </pic:cNvPicPr>
+                        </pic:nvPicPr>
+                        <pic:blipFill>
+                          <a:blip r:embed="rId12" cstate="print">
+                            <a:extLst>
+                              <a:ext uri="{28A0092B-C50C-407E-A947-70E740481C1C}">
+                                <a14:useLocalDpi xmlns:a14="http://schemas.microsoft.com/office/drawing/2010/main" val="0"/>
+                              </a:ext>
+                            </a:extLst>
+                          </a:blip>
+                          <a:srcRect/>
+                          <a:stretch>
+                            <a:fillRect/>
+                          </a:stretch>
+                        </pic:blipFill>
+                        <pic:spPr bwMode="auto">
+                          <a:xfrm>
+                            <a:off x="0" y="0"/>
+                            <a:ext cx="5198816" cy="2761871"/>
+                          </a:xfrm>
+                          <a:prstGeom prst="rect">
+                            <a:avLst/>
+                          </a:prstGeom>
+                          <a:noFill/>
+                          <a:ln>
+                            <a:noFill/>
+                          </a:ln>
+                        </pic:spPr>
+                      </pic:pic>
+                    </a:graphicData>
+                  </a:graphic>
+                </wp:inline>
+              </w:drawing>
+            </w:r>
+          </w:p>
         </w:tc>
       </w:tr>
       <w:tr>
@@ -9693,7 +10532,45 @@
             </w:tcMar>
             <w:vAlign w:val="center"/>
           </w:tcPr>
-          <w:p/>
+          <w:p>
+            <w:r>
+              <w:drawing>
+                <wp:inline distT="0" distB="0" distL="0" distR="0" wp14:anchorId="36CCA3DB" wp14:editId="48485E8F">
+                  <wp:extent cx="5289304" cy="2585357"/>
+                  <wp:effectExtent l="0" t="0" r="6985" b="5715"/>
+                  <wp:docPr id="450927435" name="Picture 1"/>
+                  <wp:cNvGraphicFramePr>
+                    <a:graphicFrameLocks xmlns:a="http://schemas.openxmlformats.org/drawingml/2006/main" noChangeAspect="1"/>
+                  </wp:cNvGraphicFramePr>
+                  <a:graphic xmlns:a="http://schemas.openxmlformats.org/drawingml/2006/main">
+                    <a:graphicData uri="http://schemas.openxmlformats.org/drawingml/2006/picture">
+                      <pic:pic xmlns:pic="http://schemas.openxmlformats.org/drawingml/2006/picture">
+                        <pic:nvPicPr>
+                          <pic:cNvPr id="450927435" name=""/>
+                          <pic:cNvPicPr/>
+                        </pic:nvPicPr>
+                        <pic:blipFill>
+                          <a:blip r:embed="rId13"/>
+                          <a:stretch>
+                            <a:fillRect/>
+                          </a:stretch>
+                        </pic:blipFill>
+                        <pic:spPr>
+                          <a:xfrm>
+                            <a:off x="0" y="0"/>
+                            <a:ext cx="5304762" cy="2592913"/>
+                          </a:xfrm>
+                          <a:prstGeom prst="rect">
+                            <a:avLst/>
+                          </a:prstGeom>
+                        </pic:spPr>
+                      </pic:pic>
+                    </a:graphicData>
+                  </a:graphic>
+                </wp:inline>
+              </w:drawing>
+            </w:r>
+          </w:p>
         </w:tc>
       </w:tr>
       <w:tr>
@@ -9725,6 +10602,7 @@
                 <w:sz w:val="18"/>
                 <w:szCs w:val="18"/>
               </w:rPr>
+              <w:lastRenderedPageBreak/>
               <w:t xml:space="preserve">Live </w:t>
             </w:r>
             <w:proofErr w:type="spellStart"/>
@@ -9771,7 +10649,206 @@
             </w:tcMar>
             <w:vAlign w:val="center"/>
           </w:tcPr>
+          <w:p>
+            <w:r>
+              <w:drawing>
+                <wp:inline distT="0" distB="0" distL="0" distR="0" wp14:anchorId="14FC3CD0" wp14:editId="42D9CB4A">
+                  <wp:extent cx="4938272" cy="2623457"/>
+                  <wp:effectExtent l="0" t="0" r="0" b="5715"/>
+                  <wp:docPr id="735196352" name="Picture 1"/>
+                  <wp:cNvGraphicFramePr>
+                    <a:graphicFrameLocks xmlns:a="http://schemas.openxmlformats.org/drawingml/2006/main" noChangeAspect="1"/>
+                  </wp:cNvGraphicFramePr>
+                  <a:graphic xmlns:a="http://schemas.openxmlformats.org/drawingml/2006/main">
+                    <a:graphicData uri="http://schemas.openxmlformats.org/drawingml/2006/picture">
+                      <pic:pic xmlns:pic="http://schemas.openxmlformats.org/drawingml/2006/picture">
+                        <pic:nvPicPr>
+                          <pic:cNvPr id="735196352" name=""/>
+                          <pic:cNvPicPr/>
+                        </pic:nvPicPr>
+                        <pic:blipFill>
+                          <a:blip r:embed="rId14"/>
+                          <a:stretch>
+                            <a:fillRect/>
+                          </a:stretch>
+                        </pic:blipFill>
+                        <pic:spPr>
+                          <a:xfrm>
+                            <a:off x="0" y="0"/>
+                            <a:ext cx="4952290" cy="2630904"/>
+                          </a:xfrm>
+                          <a:prstGeom prst="rect">
+                            <a:avLst/>
+                          </a:prstGeom>
+                        </pic:spPr>
+                      </pic:pic>
+                    </a:graphicData>
+                  </a:graphic>
+                </wp:inline>
+              </w:drawing>
+            </w:r>
+          </w:p>
           <w:p/>
+          <w:p>
+            <w:r>
+              <w:drawing>
+                <wp:inline distT="0" distB="0" distL="0" distR="0" wp14:anchorId="0BAEC10C" wp14:editId="330F9FAC">
+                  <wp:extent cx="5081709" cy="2699658"/>
+                  <wp:effectExtent l="0" t="0" r="5080" b="5715"/>
+                  <wp:docPr id="402293906" name="Picture 1"/>
+                  <wp:cNvGraphicFramePr>
+                    <a:graphicFrameLocks xmlns:a="http://schemas.openxmlformats.org/drawingml/2006/main" noChangeAspect="1"/>
+                  </wp:cNvGraphicFramePr>
+                  <a:graphic xmlns:a="http://schemas.openxmlformats.org/drawingml/2006/main">
+                    <a:graphicData uri="http://schemas.openxmlformats.org/drawingml/2006/picture">
+                      <pic:pic xmlns:pic="http://schemas.openxmlformats.org/drawingml/2006/picture">
+                        <pic:nvPicPr>
+                          <pic:cNvPr id="402293906" name=""/>
+                          <pic:cNvPicPr/>
+                        </pic:nvPicPr>
+                        <pic:blipFill>
+                          <a:blip r:embed="rId15"/>
+                          <a:stretch>
+                            <a:fillRect/>
+                          </a:stretch>
+                        </pic:blipFill>
+                        <pic:spPr>
+                          <a:xfrm>
+                            <a:off x="0" y="0"/>
+                            <a:ext cx="5107852" cy="2713546"/>
+                          </a:xfrm>
+                          <a:prstGeom prst="rect">
+                            <a:avLst/>
+                          </a:prstGeom>
+                        </pic:spPr>
+                      </pic:pic>
+                    </a:graphicData>
+                  </a:graphic>
+                </wp:inline>
+              </w:drawing>
+            </w:r>
+          </w:p>
+          <w:p/>
+          <w:p>
+            <w:r>
+              <w:drawing>
+                <wp:inline distT="0" distB="0" distL="0" distR="0" wp14:anchorId="7FA1F4E6" wp14:editId="1C0ADB03">
+                  <wp:extent cx="5194408" cy="2759529"/>
+                  <wp:effectExtent l="0" t="0" r="6350" b="3175"/>
+                  <wp:docPr id="1017986200" name="Picture 1"/>
+                  <wp:cNvGraphicFramePr>
+                    <a:graphicFrameLocks xmlns:a="http://schemas.openxmlformats.org/drawingml/2006/main" noChangeAspect="1"/>
+                  </wp:cNvGraphicFramePr>
+                  <a:graphic xmlns:a="http://schemas.openxmlformats.org/drawingml/2006/main">
+                    <a:graphicData uri="http://schemas.openxmlformats.org/drawingml/2006/picture">
+                      <pic:pic xmlns:pic="http://schemas.openxmlformats.org/drawingml/2006/picture">
+                        <pic:nvPicPr>
+                          <pic:cNvPr id="1017986200" name=""/>
+                          <pic:cNvPicPr/>
+                        </pic:nvPicPr>
+                        <pic:blipFill>
+                          <a:blip r:embed="rId16"/>
+                          <a:stretch>
+                            <a:fillRect/>
+                          </a:stretch>
+                        </pic:blipFill>
+                        <pic:spPr>
+                          <a:xfrm>
+                            <a:off x="0" y="0"/>
+                            <a:ext cx="5208611" cy="2767074"/>
+                          </a:xfrm>
+                          <a:prstGeom prst="rect">
+                            <a:avLst/>
+                          </a:prstGeom>
+                        </pic:spPr>
+                      </pic:pic>
+                    </a:graphicData>
+                  </a:graphic>
+                </wp:inline>
+              </w:drawing>
+            </w:r>
+          </w:p>
+          <w:p/>
+          <w:p>
+            <w:r>
+              <w:lastRenderedPageBreak/>
+              <w:drawing>
+                <wp:inline distT="0" distB="0" distL="0" distR="0" wp14:anchorId="2D534AAE" wp14:editId="5B4995DC">
+                  <wp:extent cx="4733365" cy="2514600"/>
+                  <wp:effectExtent l="0" t="0" r="0" b="0"/>
+                  <wp:docPr id="1735605625" name="Picture 1"/>
+                  <wp:cNvGraphicFramePr>
+                    <a:graphicFrameLocks xmlns:a="http://schemas.openxmlformats.org/drawingml/2006/main" noChangeAspect="1"/>
+                  </wp:cNvGraphicFramePr>
+                  <a:graphic xmlns:a="http://schemas.openxmlformats.org/drawingml/2006/main">
+                    <a:graphicData uri="http://schemas.openxmlformats.org/drawingml/2006/picture">
+                      <pic:pic xmlns:pic="http://schemas.openxmlformats.org/drawingml/2006/picture">
+                        <pic:nvPicPr>
+                          <pic:cNvPr id="1735605625" name=""/>
+                          <pic:cNvPicPr/>
+                        </pic:nvPicPr>
+                        <pic:blipFill>
+                          <a:blip r:embed="rId17"/>
+                          <a:stretch>
+                            <a:fillRect/>
+                          </a:stretch>
+                        </pic:blipFill>
+                        <pic:spPr>
+                          <a:xfrm>
+                            <a:off x="0" y="0"/>
+                            <a:ext cx="4740916" cy="2518612"/>
+                          </a:xfrm>
+                          <a:prstGeom prst="rect">
+                            <a:avLst/>
+                          </a:prstGeom>
+                        </pic:spPr>
+                      </pic:pic>
+                    </a:graphicData>
+                  </a:graphic>
+                </wp:inline>
+              </w:drawing>
+            </w:r>
+          </w:p>
+          <w:p/>
+          <w:p>
+            <w:r>
+              <w:drawing>
+                <wp:inline distT="0" distB="0" distL="0" distR="0" wp14:anchorId="2A5D4854" wp14:editId="74C5BF48">
+                  <wp:extent cx="5094514" cy="2706461"/>
+                  <wp:effectExtent l="0" t="0" r="0" b="0"/>
+                  <wp:docPr id="436809477" name="Picture 1"/>
+                  <wp:cNvGraphicFramePr>
+                    <a:graphicFrameLocks xmlns:a="http://schemas.openxmlformats.org/drawingml/2006/main" noChangeAspect="1"/>
+                  </wp:cNvGraphicFramePr>
+                  <a:graphic xmlns:a="http://schemas.openxmlformats.org/drawingml/2006/main">
+                    <a:graphicData uri="http://schemas.openxmlformats.org/drawingml/2006/picture">
+                      <pic:pic xmlns:pic="http://schemas.openxmlformats.org/drawingml/2006/picture">
+                        <pic:nvPicPr>
+                          <pic:cNvPr id="436809477" name=""/>
+                          <pic:cNvPicPr/>
+                        </pic:nvPicPr>
+                        <pic:blipFill>
+                          <a:blip r:embed="rId18"/>
+                          <a:stretch>
+                            <a:fillRect/>
+                          </a:stretch>
+                        </pic:blipFill>
+                        <pic:spPr>
+                          <a:xfrm>
+                            <a:off x="0" y="0"/>
+                            <a:ext cx="5105700" cy="2712404"/>
+                          </a:xfrm>
+                          <a:prstGeom prst="rect">
+                            <a:avLst/>
+                          </a:prstGeom>
+                        </pic:spPr>
+                      </pic:pic>
+                    </a:graphicData>
+                  </a:graphic>
+                </wp:inline>
+              </w:drawing>
+            </w:r>
+          </w:p>
         </w:tc>
       </w:tr>
       <w:tr>
@@ -9803,6 +10880,7 @@
                 <w:sz w:val="18"/>
                 <w:szCs w:val="18"/>
               </w:rPr>
+              <w:lastRenderedPageBreak/>
               <w:t>Assignment 04 .docx Visible in GitHub Repo</w:t>
             </w:r>
           </w:p>
@@ -9825,7 +10903,45 @@
             </w:tcMar>
             <w:vAlign w:val="center"/>
           </w:tcPr>
-          <w:p/>
+          <w:p>
+            <w:r>
+              <w:drawing>
+                <wp:inline distT="0" distB="0" distL="0" distR="0" wp14:anchorId="309C0A36" wp14:editId="6D4082AB">
+                  <wp:extent cx="6400800" cy="3400425"/>
+                  <wp:effectExtent l="0" t="0" r="0" b="9525"/>
+                  <wp:docPr id="1585109646" name="Picture 1"/>
+                  <wp:cNvGraphicFramePr>
+                    <a:graphicFrameLocks xmlns:a="http://schemas.openxmlformats.org/drawingml/2006/main" noChangeAspect="1"/>
+                  </wp:cNvGraphicFramePr>
+                  <a:graphic xmlns:a="http://schemas.openxmlformats.org/drawingml/2006/main">
+                    <a:graphicData uri="http://schemas.openxmlformats.org/drawingml/2006/picture">
+                      <pic:pic xmlns:pic="http://schemas.openxmlformats.org/drawingml/2006/picture">
+                        <pic:nvPicPr>
+                          <pic:cNvPr id="1585109646" name=""/>
+                          <pic:cNvPicPr/>
+                        </pic:nvPicPr>
+                        <pic:blipFill>
+                          <a:blip r:embed="rId19"/>
+                          <a:stretch>
+                            <a:fillRect/>
+                          </a:stretch>
+                        </pic:blipFill>
+                        <pic:spPr>
+                          <a:xfrm>
+                            <a:off x="0" y="0"/>
+                            <a:ext cx="6400800" cy="3400425"/>
+                          </a:xfrm>
+                          <a:prstGeom prst="rect">
+                            <a:avLst/>
+                          </a:prstGeom>
+                        </pic:spPr>
+                      </pic:pic>
+                    </a:graphicData>
+                  </a:graphic>
+                </wp:inline>
+              </w:drawing>
+            </w:r>
+          </w:p>
         </w:tc>
       </w:tr>
     </w:tbl>
@@ -9850,7 +10966,6 @@
           <w:sz w:val="28"/>
           <w:szCs w:val="28"/>
         </w:rPr>
-        <w:lastRenderedPageBreak/>
         <w:t>TEAM REFLECTION</w:t>
       </w:r>
     </w:p>
@@ -9884,206 +10999,65 @@
           <w:bCs/>
           <w:color w:val="000000"/>
         </w:rPr>
-        <w:t>Member 1  (Name: _______________________________________________)</w:t>
-      </w:r>
-    </w:p>
-    <w:tbl>
-      <w:tblPr>
-        <w:tblW w:w="9360" w:type="dxa"/>
-        <w:tblBorders>
-          <w:top w:val="single" w:sz="4" w:space="0" w:color="auto"/>
-          <w:left w:val="single" w:sz="4" w:space="0" w:color="auto"/>
-          <w:bottom w:val="single" w:sz="4" w:space="0" w:color="auto"/>
-          <w:right w:val="single" w:sz="4" w:space="0" w:color="auto"/>
-          <w:insideH w:val="single" w:sz="4" w:space="0" w:color="auto"/>
-          <w:insideV w:val="single" w:sz="4" w:space="0" w:color="auto"/>
-        </w:tblBorders>
-        <w:tblCellMar>
-          <w:left w:w="10" w:type="dxa"/>
-          <w:right w:w="10" w:type="dxa"/>
-        </w:tblCellMar>
-        <w:tblLook w:val="0000" w:firstRow="0" w:lastRow="0" w:firstColumn="0" w:lastColumn="0" w:noHBand="0" w:noVBand="0"/>
-      </w:tblPr>
-      <w:tblGrid>
-        <w:gridCol w:w="9360"/>
-      </w:tblGrid>
-      <w:tr>
-        <w:tc>
-          <w:tcPr>
-            <w:tcW w:w="9360" w:type="dxa"/>
-            <w:tcBorders>
-              <w:top w:val="single" w:sz="6" w:space="0" w:color="ADB9CA"/>
-              <w:left w:val="single" w:sz="6" w:space="0" w:color="ADB9CA"/>
-              <w:bottom w:val="single" w:sz="6" w:space="0" w:color="ADB9CA"/>
-              <w:right w:val="single" w:sz="6" w:space="0" w:color="ADB9CA"/>
-            </w:tcBorders>
-            <w:shd w:val="clear" w:color="auto" w:fill="FFFFFF"/>
-            <w:tcMar>
-              <w:top w:w="80" w:type="dxa"/>
-              <w:left w:w="140" w:type="dxa"/>
-              <w:bottom w:w="80" w:type="dxa"/>
-              <w:right w:w="140" w:type="dxa"/>
-            </w:tcMar>
-            <w:vAlign w:val="center"/>
-          </w:tcPr>
-          <w:p/>
-        </w:tc>
-      </w:tr>
-      <w:tr>
-        <w:tc>
-          <w:tcPr>
-            <w:tcW w:w="9360" w:type="dxa"/>
-            <w:tcBorders>
-              <w:top w:val="single" w:sz="6" w:space="0" w:color="ADB9CA"/>
-              <w:left w:val="single" w:sz="6" w:space="0" w:color="ADB9CA"/>
-              <w:bottom w:val="single" w:sz="6" w:space="0" w:color="ADB9CA"/>
-              <w:right w:val="single" w:sz="6" w:space="0" w:color="ADB9CA"/>
-            </w:tcBorders>
-            <w:shd w:val="clear" w:color="auto" w:fill="FFFFFF"/>
-            <w:tcMar>
-              <w:top w:w="80" w:type="dxa"/>
-              <w:left w:w="140" w:type="dxa"/>
-              <w:bottom w:w="80" w:type="dxa"/>
-              <w:right w:w="140" w:type="dxa"/>
-            </w:tcMar>
-            <w:vAlign w:val="center"/>
-          </w:tcPr>
-          <w:p/>
-        </w:tc>
-      </w:tr>
-      <w:tr>
-        <w:tc>
-          <w:tcPr>
-            <w:tcW w:w="9360" w:type="dxa"/>
-            <w:tcBorders>
-              <w:top w:val="single" w:sz="6" w:space="0" w:color="ADB9CA"/>
-              <w:left w:val="single" w:sz="6" w:space="0" w:color="ADB9CA"/>
-              <w:bottom w:val="single" w:sz="6" w:space="0" w:color="ADB9CA"/>
-              <w:right w:val="single" w:sz="6" w:space="0" w:color="ADB9CA"/>
-            </w:tcBorders>
-            <w:shd w:val="clear" w:color="auto" w:fill="FFFFFF"/>
-            <w:tcMar>
-              <w:top w:w="80" w:type="dxa"/>
-              <w:left w:w="140" w:type="dxa"/>
-              <w:bottom w:w="80" w:type="dxa"/>
-              <w:right w:w="140" w:type="dxa"/>
-            </w:tcMar>
-            <w:vAlign w:val="center"/>
-          </w:tcPr>
-          <w:p/>
-        </w:tc>
-      </w:tr>
-    </w:tbl>
+        <w:t xml:space="preserve">Member </w:t>
+      </w:r>
+      <w:proofErr w:type="gramStart"/>
+      <w:r>
+        <w:rPr>
+          <w:rFonts w:ascii="Arial" w:eastAsia="Arial" w:hAnsi="Arial" w:cs="Arial"/>
+          <w:b/>
+          <w:bCs/>
+          <w:color w:val="000000"/>
+        </w:rPr>
+        <w:t>1  (</w:t>
+      </w:r>
+      <w:proofErr w:type="gramEnd"/>
+      <w:r>
+        <w:rPr>
+          <w:rFonts w:ascii="Arial" w:eastAsia="Arial" w:hAnsi="Arial" w:cs="Arial"/>
+          <w:b/>
+          <w:bCs/>
+          <w:color w:val="000000"/>
+        </w:rPr>
+        <w:t xml:space="preserve">Name: </w:t>
+      </w:r>
+      <w:r>
+        <w:rPr>
+          <w:rFonts w:ascii="Arial" w:eastAsia="Arial" w:hAnsi="Arial" w:cs="Arial"/>
+          <w:b/>
+          <w:bCs/>
+          <w:color w:val="000000"/>
+        </w:rPr>
+        <w:t>abdul manaf</w:t>
+      </w:r>
+      <w:r>
+        <w:rPr>
+          <w:rFonts w:ascii="Arial" w:eastAsia="Arial" w:hAnsi="Arial" w:cs="Arial"/>
+          <w:b/>
+          <w:bCs/>
+          <w:color w:val="000000"/>
+        </w:rPr>
+        <w:t>)</w:t>
+      </w:r>
+    </w:p>
     <w:p>
       <w:pPr>
         <w:spacing w:after="100"/>
       </w:pPr>
+      <w:r>
+        <w:t>In this assignment, I learnt how to design and implement a complete CI/CD pipeline using GitHub Actions, Docker Hub, and Render as the deployment platform. As Team Lead, I was responsible for setting up the entire repository structure, configuring branch protection rules, managing secrets, and writing both the CI and CD workflow files from scratch. The most challenging part was configuring the GitHub Environment secrets correctly and ensuring the CD workflow could access the RENDER_DEPLOY_HOOK_URL without exposing it publicly. Another difficulty was triggering the CI workflow for the first time so that the status check appeared in branch protection settings, which required creating a test PR manually. As a team, we resolved these issues by carefully reading the GitHub Actions documentation and testing each workflow step individually until the full automated pipeline from feature branch to live Render deployment was working correctly.</w:t>
+      </w:r>
     </w:p>
     <w:p>
       <w:pPr>
         <w:spacing w:before="60" w:after="60"/>
         <w:jc w:val="both"/>
-      </w:pPr>
-      <w:r>
         <w:rPr>
           <w:rFonts w:ascii="Arial" w:eastAsia="Arial" w:hAnsi="Arial" w:cs="Arial"/>
           <w:b/>
           <w:bCs/>
           <w:color w:val="000000"/>
         </w:rPr>
-        <w:t>Member 2  (Name: _______________________________________________)</w:t>
-      </w:r>
-    </w:p>
-    <w:tbl>
-      <w:tblPr>
-        <w:tblW w:w="9360" w:type="dxa"/>
-        <w:tblBorders>
-          <w:top w:val="single" w:sz="4" w:space="0" w:color="auto"/>
-          <w:left w:val="single" w:sz="4" w:space="0" w:color="auto"/>
-          <w:bottom w:val="single" w:sz="4" w:space="0" w:color="auto"/>
-          <w:right w:val="single" w:sz="4" w:space="0" w:color="auto"/>
-          <w:insideH w:val="single" w:sz="4" w:space="0" w:color="auto"/>
-          <w:insideV w:val="single" w:sz="4" w:space="0" w:color="auto"/>
-        </w:tblBorders>
-        <w:tblCellMar>
-          <w:left w:w="10" w:type="dxa"/>
-          <w:right w:w="10" w:type="dxa"/>
-        </w:tblCellMar>
-        <w:tblLook w:val="0000" w:firstRow="0" w:lastRow="0" w:firstColumn="0" w:lastColumn="0" w:noHBand="0" w:noVBand="0"/>
-      </w:tblPr>
-      <w:tblGrid>
-        <w:gridCol w:w="9360"/>
-      </w:tblGrid>
-      <w:tr>
-        <w:tc>
-          <w:tcPr>
-            <w:tcW w:w="9360" w:type="dxa"/>
-            <w:tcBorders>
-              <w:top w:val="single" w:sz="6" w:space="0" w:color="ADB9CA"/>
-              <w:left w:val="single" w:sz="6" w:space="0" w:color="ADB9CA"/>
-              <w:bottom w:val="single" w:sz="6" w:space="0" w:color="ADB9CA"/>
-              <w:right w:val="single" w:sz="6" w:space="0" w:color="ADB9CA"/>
-            </w:tcBorders>
-            <w:shd w:val="clear" w:color="auto" w:fill="FFFFFF"/>
-            <w:tcMar>
-              <w:top w:w="80" w:type="dxa"/>
-              <w:left w:w="140" w:type="dxa"/>
-              <w:bottom w:w="80" w:type="dxa"/>
-              <w:right w:w="140" w:type="dxa"/>
-            </w:tcMar>
-            <w:vAlign w:val="center"/>
-          </w:tcPr>
-          <w:p/>
-        </w:tc>
-      </w:tr>
-      <w:tr>
-        <w:tc>
-          <w:tcPr>
-            <w:tcW w:w="9360" w:type="dxa"/>
-            <w:tcBorders>
-              <w:top w:val="single" w:sz="6" w:space="0" w:color="ADB9CA"/>
-              <w:left w:val="single" w:sz="6" w:space="0" w:color="ADB9CA"/>
-              <w:bottom w:val="single" w:sz="6" w:space="0" w:color="ADB9CA"/>
-              <w:right w:val="single" w:sz="6" w:space="0" w:color="ADB9CA"/>
-            </w:tcBorders>
-            <w:shd w:val="clear" w:color="auto" w:fill="FFFFFF"/>
-            <w:tcMar>
-              <w:top w:w="80" w:type="dxa"/>
-              <w:left w:w="140" w:type="dxa"/>
-              <w:bottom w:w="80" w:type="dxa"/>
-              <w:right w:w="140" w:type="dxa"/>
-            </w:tcMar>
-            <w:vAlign w:val="center"/>
-          </w:tcPr>
-          <w:p/>
-        </w:tc>
-      </w:tr>
-      <w:tr>
-        <w:tc>
-          <w:tcPr>
-            <w:tcW w:w="9360" w:type="dxa"/>
-            <w:tcBorders>
-              <w:top w:val="single" w:sz="6" w:space="0" w:color="ADB9CA"/>
-              <w:left w:val="single" w:sz="6" w:space="0" w:color="ADB9CA"/>
-              <w:bottom w:val="single" w:sz="6" w:space="0" w:color="ADB9CA"/>
-              <w:right w:val="single" w:sz="6" w:space="0" w:color="ADB9CA"/>
-            </w:tcBorders>
-            <w:shd w:val="clear" w:color="auto" w:fill="FFFFFF"/>
-            <w:tcMar>
-              <w:top w:w="80" w:type="dxa"/>
-              <w:left w:w="140" w:type="dxa"/>
-              <w:bottom w:w="80" w:type="dxa"/>
-              <w:right w:w="140" w:type="dxa"/>
-            </w:tcMar>
-            <w:vAlign w:val="center"/>
-          </w:tcPr>
-          <w:p/>
-        </w:tc>
-      </w:tr>
-    </w:tbl>
-    <w:p>
-      <w:pPr>
-        <w:spacing w:after="100"/>
       </w:pPr>
     </w:p>
     <w:p>
@@ -10098,322 +11072,308 @@
           <w:bCs/>
           <w:color w:val="000000"/>
         </w:rPr>
-        <w:t>Member 3  (Name: _______________________________________________)</w:t>
-      </w:r>
-    </w:p>
-    <w:tbl>
-      <w:tblPr>
-        <w:tblW w:w="9360" w:type="dxa"/>
-        <w:tblBorders>
-          <w:top w:val="single" w:sz="4" w:space="0" w:color="auto"/>
-          <w:left w:val="single" w:sz="4" w:space="0" w:color="auto"/>
-          <w:bottom w:val="single" w:sz="4" w:space="0" w:color="auto"/>
-          <w:right w:val="single" w:sz="4" w:space="0" w:color="auto"/>
-          <w:insideH w:val="single" w:sz="4" w:space="0" w:color="auto"/>
-          <w:insideV w:val="single" w:sz="4" w:space="0" w:color="auto"/>
-        </w:tblBorders>
-        <w:tblCellMar>
-          <w:left w:w="10" w:type="dxa"/>
-          <w:right w:w="10" w:type="dxa"/>
-        </w:tblCellMar>
-        <w:tblLook w:val="0000" w:firstRow="0" w:lastRow="0" w:firstColumn="0" w:lastColumn="0" w:noHBand="0" w:noVBand="0"/>
-      </w:tblPr>
-      <w:tblGrid>
-        <w:gridCol w:w="9360"/>
-      </w:tblGrid>
-      <w:tr>
-        <w:tc>
-          <w:tcPr>
-            <w:tcW w:w="9360" w:type="dxa"/>
-            <w:tcBorders>
-              <w:top w:val="single" w:sz="6" w:space="0" w:color="ADB9CA"/>
-              <w:left w:val="single" w:sz="6" w:space="0" w:color="ADB9CA"/>
-              <w:bottom w:val="single" w:sz="6" w:space="0" w:color="ADB9CA"/>
-              <w:right w:val="single" w:sz="6" w:space="0" w:color="ADB9CA"/>
-            </w:tcBorders>
-            <w:shd w:val="clear" w:color="auto" w:fill="FFFFFF"/>
-            <w:tcMar>
-              <w:top w:w="80" w:type="dxa"/>
-              <w:left w:w="140" w:type="dxa"/>
-              <w:bottom w:w="80" w:type="dxa"/>
-              <w:right w:w="140" w:type="dxa"/>
-            </w:tcMar>
-            <w:vAlign w:val="center"/>
-          </w:tcPr>
-          <w:p/>
-        </w:tc>
-      </w:tr>
-      <w:tr>
-        <w:tc>
-          <w:tcPr>
-            <w:tcW w:w="9360" w:type="dxa"/>
-            <w:tcBorders>
-              <w:top w:val="single" w:sz="6" w:space="0" w:color="ADB9CA"/>
-              <w:left w:val="single" w:sz="6" w:space="0" w:color="ADB9CA"/>
-              <w:bottom w:val="single" w:sz="6" w:space="0" w:color="ADB9CA"/>
-              <w:right w:val="single" w:sz="6" w:space="0" w:color="ADB9CA"/>
-            </w:tcBorders>
-            <w:shd w:val="clear" w:color="auto" w:fill="FFFFFF"/>
-            <w:tcMar>
-              <w:top w:w="80" w:type="dxa"/>
-              <w:left w:w="140" w:type="dxa"/>
-              <w:bottom w:w="80" w:type="dxa"/>
-              <w:right w:w="140" w:type="dxa"/>
-            </w:tcMar>
-            <w:vAlign w:val="center"/>
-          </w:tcPr>
-          <w:p/>
-        </w:tc>
-      </w:tr>
-      <w:tr>
-        <w:tc>
-          <w:tcPr>
-            <w:tcW w:w="9360" w:type="dxa"/>
-            <w:tcBorders>
-              <w:top w:val="single" w:sz="6" w:space="0" w:color="ADB9CA"/>
-              <w:left w:val="single" w:sz="6" w:space="0" w:color="ADB9CA"/>
-              <w:bottom w:val="single" w:sz="6" w:space="0" w:color="ADB9CA"/>
-              <w:right w:val="single" w:sz="6" w:space="0" w:color="ADB9CA"/>
-            </w:tcBorders>
-            <w:shd w:val="clear" w:color="auto" w:fill="FFFFFF"/>
-            <w:tcMar>
-              <w:top w:w="80" w:type="dxa"/>
-              <w:left w:w="140" w:type="dxa"/>
-              <w:bottom w:w="80" w:type="dxa"/>
-              <w:right w:w="140" w:type="dxa"/>
-            </w:tcMar>
-            <w:vAlign w:val="center"/>
-          </w:tcPr>
-          <w:p/>
-        </w:tc>
-      </w:tr>
-    </w:tbl>
+        <w:t xml:space="preserve">Member </w:t>
+      </w:r>
+      <w:proofErr w:type="gramStart"/>
+      <w:r>
+        <w:rPr>
+          <w:rFonts w:ascii="Arial" w:eastAsia="Arial" w:hAnsi="Arial" w:cs="Arial"/>
+          <w:b/>
+          <w:bCs/>
+          <w:color w:val="000000"/>
+        </w:rPr>
+        <w:t>2  (</w:t>
+      </w:r>
+      <w:proofErr w:type="gramEnd"/>
+      <w:r>
+        <w:rPr>
+          <w:rFonts w:ascii="Arial" w:eastAsia="Arial" w:hAnsi="Arial" w:cs="Arial"/>
+          <w:b/>
+          <w:bCs/>
+          <w:color w:val="000000"/>
+        </w:rPr>
+        <w:t xml:space="preserve">Name: </w:t>
+      </w:r>
+      <w:r>
+        <w:rPr>
+          <w:rFonts w:ascii="Arial" w:eastAsia="Arial" w:hAnsi="Arial" w:cs="Arial"/>
+          <w:b/>
+          <w:bCs/>
+          <w:color w:val="000000"/>
+        </w:rPr>
+        <w:t>Muhammad Ahad Farooq</w:t>
+      </w:r>
+      <w:r>
+        <w:rPr>
+          <w:rFonts w:ascii="Arial" w:eastAsia="Arial" w:hAnsi="Arial" w:cs="Arial"/>
+          <w:b/>
+          <w:bCs/>
+          <w:color w:val="000000"/>
+        </w:rPr>
+        <w:t>)</w:t>
+      </w:r>
+    </w:p>
     <w:p>
       <w:pPr>
         <w:spacing w:after="100"/>
       </w:pPr>
+      <w:r>
+        <w:t xml:space="preserve">I created the Add Task page for the </w:t>
+      </w:r>
+      <w:proofErr w:type="spellStart"/>
+      <w:r>
+        <w:t>TaskFlow</w:t>
+      </w:r>
+      <w:proofErr w:type="spellEnd"/>
+      <w:r>
+        <w:t xml:space="preserve"> application using HTML and the shared stylesheet. I learned how to work with Git branches, commits, pull requests, and GitHub Actions. The most challenging part was understanding the CI/CD workflow and PR process. Our team resolved issues through collaboration and testing. This assignment improved my understanding of DevOps practices and automated deployment.</w:t>
+      </w:r>
     </w:p>
     <w:p>
       <w:pPr>
         <w:spacing w:before="60" w:after="60"/>
         <w:jc w:val="both"/>
-      </w:pPr>
-      <w:r>
         <w:rPr>
           <w:rFonts w:ascii="Arial" w:eastAsia="Arial" w:hAnsi="Arial" w:cs="Arial"/>
           <w:b/>
           <w:bCs/>
           <w:color w:val="000000"/>
         </w:rPr>
-        <w:t>Member 4  (Name: _______________________________________________)</w:t>
-      </w:r>
-    </w:p>
-    <w:tbl>
-      <w:tblPr>
-        <w:tblW w:w="9360" w:type="dxa"/>
-        <w:tblBorders>
-          <w:top w:val="single" w:sz="4" w:space="0" w:color="auto"/>
-          <w:left w:val="single" w:sz="4" w:space="0" w:color="auto"/>
-          <w:bottom w:val="single" w:sz="4" w:space="0" w:color="auto"/>
-          <w:right w:val="single" w:sz="4" w:space="0" w:color="auto"/>
-          <w:insideH w:val="single" w:sz="4" w:space="0" w:color="auto"/>
-          <w:insideV w:val="single" w:sz="4" w:space="0" w:color="auto"/>
-        </w:tblBorders>
-        <w:tblCellMar>
-          <w:left w:w="10" w:type="dxa"/>
-          <w:right w:w="10" w:type="dxa"/>
-        </w:tblCellMar>
-        <w:tblLook w:val="0000" w:firstRow="0" w:lastRow="0" w:firstColumn="0" w:lastColumn="0" w:noHBand="0" w:noVBand="0"/>
-      </w:tblPr>
-      <w:tblGrid>
-        <w:gridCol w:w="9360"/>
-      </w:tblGrid>
-      <w:tr>
-        <w:tc>
-          <w:tcPr>
-            <w:tcW w:w="9360" w:type="dxa"/>
-            <w:tcBorders>
-              <w:top w:val="single" w:sz="6" w:space="0" w:color="ADB9CA"/>
-              <w:left w:val="single" w:sz="6" w:space="0" w:color="ADB9CA"/>
-              <w:bottom w:val="single" w:sz="6" w:space="0" w:color="ADB9CA"/>
-              <w:right w:val="single" w:sz="6" w:space="0" w:color="ADB9CA"/>
-            </w:tcBorders>
-            <w:shd w:val="clear" w:color="auto" w:fill="FFFFFF"/>
-            <w:tcMar>
-              <w:top w:w="80" w:type="dxa"/>
-              <w:left w:w="140" w:type="dxa"/>
-              <w:bottom w:w="80" w:type="dxa"/>
-              <w:right w:w="140" w:type="dxa"/>
-            </w:tcMar>
-            <w:vAlign w:val="center"/>
-          </w:tcPr>
-          <w:p/>
-        </w:tc>
-      </w:tr>
-      <w:tr>
-        <w:tc>
-          <w:tcPr>
-            <w:tcW w:w="9360" w:type="dxa"/>
-            <w:tcBorders>
-              <w:top w:val="single" w:sz="6" w:space="0" w:color="ADB9CA"/>
-              <w:left w:val="single" w:sz="6" w:space="0" w:color="ADB9CA"/>
-              <w:bottom w:val="single" w:sz="6" w:space="0" w:color="ADB9CA"/>
-              <w:right w:val="single" w:sz="6" w:space="0" w:color="ADB9CA"/>
-            </w:tcBorders>
-            <w:shd w:val="clear" w:color="auto" w:fill="FFFFFF"/>
-            <w:tcMar>
-              <w:top w:w="80" w:type="dxa"/>
-              <w:left w:w="140" w:type="dxa"/>
-              <w:bottom w:w="80" w:type="dxa"/>
-              <w:right w:w="140" w:type="dxa"/>
-            </w:tcMar>
-            <w:vAlign w:val="center"/>
-          </w:tcPr>
-          <w:p/>
-        </w:tc>
-      </w:tr>
-      <w:tr>
-        <w:tc>
-          <w:tcPr>
-            <w:tcW w:w="9360" w:type="dxa"/>
-            <w:tcBorders>
-              <w:top w:val="single" w:sz="6" w:space="0" w:color="ADB9CA"/>
-              <w:left w:val="single" w:sz="6" w:space="0" w:color="ADB9CA"/>
-              <w:bottom w:val="single" w:sz="6" w:space="0" w:color="ADB9CA"/>
-              <w:right w:val="single" w:sz="6" w:space="0" w:color="ADB9CA"/>
-            </w:tcBorders>
-            <w:shd w:val="clear" w:color="auto" w:fill="FFFFFF"/>
-            <w:tcMar>
-              <w:top w:w="80" w:type="dxa"/>
-              <w:left w:w="140" w:type="dxa"/>
-              <w:bottom w:w="80" w:type="dxa"/>
-              <w:right w:w="140" w:type="dxa"/>
-            </w:tcMar>
-            <w:vAlign w:val="center"/>
-          </w:tcPr>
-          <w:p/>
-        </w:tc>
-      </w:tr>
-    </w:tbl>
-    <w:p>
-      <w:pPr>
-        <w:spacing w:after="100"/>
       </w:pPr>
     </w:p>
     <w:p>
       <w:pPr>
         <w:spacing w:before="60" w:after="60"/>
         <w:jc w:val="both"/>
-      </w:pPr>
-      <w:r>
         <w:rPr>
           <w:rFonts w:ascii="Arial" w:eastAsia="Arial" w:hAnsi="Arial" w:cs="Arial"/>
           <w:b/>
           <w:bCs/>
           <w:color w:val="000000"/>
         </w:rPr>
-        <w:t>Member 5  (Name: _______________________________________________)</w:t>
-      </w:r>
-    </w:p>
-    <w:tbl>
-      <w:tblPr>
-        <w:tblW w:w="9360" w:type="dxa"/>
-        <w:tblBorders>
-          <w:top w:val="single" w:sz="4" w:space="0" w:color="auto"/>
-          <w:left w:val="single" w:sz="4" w:space="0" w:color="auto"/>
-          <w:bottom w:val="single" w:sz="4" w:space="0" w:color="auto"/>
-          <w:right w:val="single" w:sz="4" w:space="0" w:color="auto"/>
-          <w:insideH w:val="single" w:sz="4" w:space="0" w:color="auto"/>
-          <w:insideV w:val="single" w:sz="4" w:space="0" w:color="auto"/>
-        </w:tblBorders>
-        <w:tblCellMar>
-          <w:left w:w="10" w:type="dxa"/>
-          <w:right w:w="10" w:type="dxa"/>
-        </w:tblCellMar>
-        <w:tblLook w:val="0000" w:firstRow="0" w:lastRow="0" w:firstColumn="0" w:lastColumn="0" w:noHBand="0" w:noVBand="0"/>
-      </w:tblPr>
-      <w:tblGrid>
-        <w:gridCol w:w="9360"/>
-      </w:tblGrid>
-      <w:tr>
-        <w:tc>
-          <w:tcPr>
-            <w:tcW w:w="9360" w:type="dxa"/>
-            <w:tcBorders>
-              <w:top w:val="single" w:sz="6" w:space="0" w:color="ADB9CA"/>
-              <w:left w:val="single" w:sz="6" w:space="0" w:color="ADB9CA"/>
-              <w:bottom w:val="single" w:sz="6" w:space="0" w:color="ADB9CA"/>
-              <w:right w:val="single" w:sz="6" w:space="0" w:color="ADB9CA"/>
-            </w:tcBorders>
-            <w:shd w:val="clear" w:color="auto" w:fill="FFFFFF"/>
-            <w:tcMar>
-              <w:top w:w="80" w:type="dxa"/>
-              <w:left w:w="140" w:type="dxa"/>
-              <w:bottom w:w="80" w:type="dxa"/>
-              <w:right w:w="140" w:type="dxa"/>
-            </w:tcMar>
-            <w:vAlign w:val="center"/>
-          </w:tcPr>
-          <w:p/>
-        </w:tc>
-      </w:tr>
-      <w:tr>
-        <w:tc>
-          <w:tcPr>
-            <w:tcW w:w="9360" w:type="dxa"/>
-            <w:tcBorders>
-              <w:top w:val="single" w:sz="6" w:space="0" w:color="ADB9CA"/>
-              <w:left w:val="single" w:sz="6" w:space="0" w:color="ADB9CA"/>
-              <w:bottom w:val="single" w:sz="6" w:space="0" w:color="ADB9CA"/>
-              <w:right w:val="single" w:sz="6" w:space="0" w:color="ADB9CA"/>
-            </w:tcBorders>
-            <w:shd w:val="clear" w:color="auto" w:fill="FFFFFF"/>
-            <w:tcMar>
-              <w:top w:w="80" w:type="dxa"/>
-              <w:left w:w="140" w:type="dxa"/>
-              <w:bottom w:w="80" w:type="dxa"/>
-              <w:right w:w="140" w:type="dxa"/>
-            </w:tcMar>
-            <w:vAlign w:val="center"/>
-          </w:tcPr>
-          <w:p/>
-        </w:tc>
-      </w:tr>
-      <w:tr>
-        <w:tc>
-          <w:tcPr>
-            <w:tcW w:w="9360" w:type="dxa"/>
-            <w:tcBorders>
-              <w:top w:val="single" w:sz="6" w:space="0" w:color="ADB9CA"/>
-              <w:left w:val="single" w:sz="6" w:space="0" w:color="ADB9CA"/>
-              <w:bottom w:val="single" w:sz="6" w:space="0" w:color="ADB9CA"/>
-              <w:right w:val="single" w:sz="6" w:space="0" w:color="ADB9CA"/>
-            </w:tcBorders>
-            <w:shd w:val="clear" w:color="auto" w:fill="FFFFFF"/>
-            <w:tcMar>
-              <w:top w:w="80" w:type="dxa"/>
-              <w:left w:w="140" w:type="dxa"/>
-              <w:bottom w:w="80" w:type="dxa"/>
-              <w:right w:w="140" w:type="dxa"/>
-            </w:tcMar>
-            <w:vAlign w:val="center"/>
-          </w:tcPr>
-          <w:p/>
-        </w:tc>
-      </w:tr>
-    </w:tbl>
+      </w:pPr>
+      <w:r>
+        <w:rPr>
+          <w:rFonts w:ascii="Arial" w:eastAsia="Arial" w:hAnsi="Arial" w:cs="Arial"/>
+          <w:b/>
+          <w:bCs/>
+          <w:color w:val="000000"/>
+        </w:rPr>
+        <w:t xml:space="preserve">Member </w:t>
+      </w:r>
+      <w:proofErr w:type="gramStart"/>
+      <w:r>
+        <w:rPr>
+          <w:rFonts w:ascii="Arial" w:eastAsia="Arial" w:hAnsi="Arial" w:cs="Arial"/>
+          <w:b/>
+          <w:bCs/>
+          <w:color w:val="000000"/>
+        </w:rPr>
+        <w:t>3  (</w:t>
+      </w:r>
+      <w:proofErr w:type="gramEnd"/>
+      <w:r>
+        <w:rPr>
+          <w:rFonts w:ascii="Arial" w:eastAsia="Arial" w:hAnsi="Arial" w:cs="Arial"/>
+          <w:b/>
+          <w:bCs/>
+          <w:color w:val="000000"/>
+        </w:rPr>
+        <w:t xml:space="preserve">Name: </w:t>
+      </w:r>
+      <w:r>
+        <w:rPr>
+          <w:rFonts w:ascii="Arial" w:eastAsia="Arial" w:hAnsi="Arial" w:cs="Arial"/>
+          <w:b/>
+          <w:bCs/>
+          <w:color w:val="000000"/>
+        </w:rPr>
+        <w:t>Faizan Asim</w:t>
+      </w:r>
+      <w:r>
+        <w:rPr>
+          <w:rFonts w:ascii="Arial" w:eastAsia="Arial" w:hAnsi="Arial" w:cs="Arial"/>
+          <w:b/>
+          <w:bCs/>
+          <w:color w:val="000000"/>
+        </w:rPr>
+        <w:t>)</w:t>
+      </w:r>
+    </w:p>
+    <w:p>
+      <w:pPr>
+        <w:spacing w:before="60" w:after="60"/>
+        <w:jc w:val="both"/>
+      </w:pPr>
+      <w:r>
+        <w:t xml:space="preserve">n this assignment, I learnt how to create a feature branch, build an HTML page, and open a Pull Request targeting the develop branch following a proper Git workflow. I was responsible for developing the Task List page which displays tasks in a table with filter buttons for All, Pending, and Completed status. The most challenging part was correctly linking the shared style.css and ensuring my page design was consistent with the rest of the </w:t>
+      </w:r>
+      <w:proofErr w:type="spellStart"/>
+      <w:r>
+        <w:t>TaskFlow</w:t>
+      </w:r>
+      <w:proofErr w:type="spellEnd"/>
+      <w:r>
+        <w:t xml:space="preserve"> application. The Team Lead guided me through the correct branching convention and after CI passed on my PR, the Team Lead merged it which automatically triggered the CD pipeline and deployed my page live on Render.</w:t>
+      </w:r>
+    </w:p>
+    <w:p>
+      <w:pPr>
+        <w:spacing w:before="60" w:after="60"/>
+        <w:jc w:val="both"/>
+      </w:pPr>
+    </w:p>
+    <w:p>
+      <w:pPr>
+        <w:spacing w:before="60" w:after="60"/>
+        <w:jc w:val="both"/>
+      </w:pPr>
+      <w:r>
+        <w:rPr>
+          <w:rFonts w:ascii="Arial" w:eastAsia="Arial" w:hAnsi="Arial" w:cs="Arial"/>
+          <w:b/>
+          <w:bCs/>
+          <w:color w:val="000000"/>
+        </w:rPr>
+        <w:lastRenderedPageBreak/>
+        <w:t xml:space="preserve">Member </w:t>
+      </w:r>
+      <w:proofErr w:type="gramStart"/>
+      <w:r>
+        <w:rPr>
+          <w:rFonts w:ascii="Arial" w:eastAsia="Arial" w:hAnsi="Arial" w:cs="Arial"/>
+          <w:b/>
+          <w:bCs/>
+          <w:color w:val="000000"/>
+        </w:rPr>
+        <w:t>4  (</w:t>
+      </w:r>
+      <w:proofErr w:type="gramEnd"/>
+      <w:r>
+        <w:rPr>
+          <w:rFonts w:ascii="Arial" w:eastAsia="Arial" w:hAnsi="Arial" w:cs="Arial"/>
+          <w:b/>
+          <w:bCs/>
+          <w:color w:val="000000"/>
+        </w:rPr>
+        <w:t xml:space="preserve">Name: </w:t>
+      </w:r>
+      <w:r>
+        <w:rPr>
+          <w:rFonts w:ascii="Arial" w:eastAsia="Arial" w:hAnsi="Arial" w:cs="Arial"/>
+          <w:b/>
+          <w:bCs/>
+          <w:color w:val="000000"/>
+        </w:rPr>
+        <w:t>Muhammad Zain</w:t>
+      </w:r>
+      <w:r>
+        <w:rPr>
+          <w:rFonts w:ascii="Arial" w:eastAsia="Arial" w:hAnsi="Arial" w:cs="Arial"/>
+          <w:b/>
+          <w:bCs/>
+          <w:color w:val="000000"/>
+        </w:rPr>
+        <w:t>)</w:t>
+      </w:r>
+    </w:p>
     <w:p>
       <w:pPr>
         <w:spacing w:after="100"/>
       </w:pPr>
+      <w:r>
+        <w:t>Through this assignment, I learned how to work with Git branches, create feature branches, and collaborate using Pull Requests in a real team workflow, along with how CI pipelines automatically check code before it gets merged. The most challenging part for me was getting comfortable with Git commands and GitHub authentication, since I hadn't used version control like this before — setting up a Personal Access Token instead of a password was something new. I resolved this by following a step-by-step guide and testing each command carefully before pushing my changes. Overall, I gained a much better understanding of how teams collaborate on shared codebases without overwriting each other's work.</w:t>
+      </w:r>
+    </w:p>
+    <w:p>
+      <w:pPr>
+        <w:spacing w:before="60" w:after="60"/>
+        <w:jc w:val="both"/>
+        <w:rPr>
+          <w:rFonts w:ascii="Arial" w:eastAsia="Arial" w:hAnsi="Arial" w:cs="Arial"/>
+          <w:b/>
+          <w:bCs/>
+          <w:color w:val="000000"/>
+        </w:rPr>
+      </w:pPr>
+    </w:p>
+    <w:p>
+      <w:pPr>
+        <w:spacing w:before="60" w:after="60"/>
+        <w:jc w:val="both"/>
+      </w:pPr>
+      <w:r>
+        <w:rPr>
+          <w:rFonts w:ascii="Arial" w:eastAsia="Arial" w:hAnsi="Arial" w:cs="Arial"/>
+          <w:b/>
+          <w:bCs/>
+          <w:color w:val="000000"/>
+        </w:rPr>
+        <w:t xml:space="preserve">Member </w:t>
+      </w:r>
+      <w:proofErr w:type="gramStart"/>
+      <w:r>
+        <w:rPr>
+          <w:rFonts w:ascii="Arial" w:eastAsia="Arial" w:hAnsi="Arial" w:cs="Arial"/>
+          <w:b/>
+          <w:bCs/>
+          <w:color w:val="000000"/>
+        </w:rPr>
+        <w:t>5  (</w:t>
+      </w:r>
+      <w:proofErr w:type="gramEnd"/>
+      <w:r>
+        <w:rPr>
+          <w:rFonts w:ascii="Arial" w:eastAsia="Arial" w:hAnsi="Arial" w:cs="Arial"/>
+          <w:b/>
+          <w:bCs/>
+          <w:color w:val="000000"/>
+        </w:rPr>
+        <w:t>Name:</w:t>
+      </w:r>
+      <w:r>
+        <w:rPr>
+          <w:rFonts w:ascii="Arial" w:eastAsia="Arial" w:hAnsi="Arial" w:cs="Arial"/>
+          <w:b/>
+          <w:bCs/>
+          <w:color w:val="000000"/>
+        </w:rPr>
+        <w:t xml:space="preserve"> </w:t>
+      </w:r>
+      <w:r>
+        <w:rPr>
+          <w:rFonts w:ascii="Arial" w:eastAsia="Arial" w:hAnsi="Arial" w:cs="Arial"/>
+          <w:b/>
+          <w:bCs/>
+          <w:color w:val="000000"/>
+        </w:rPr>
+        <w:t>Syed Ashhad Hassan</w:t>
+      </w:r>
+      <w:r>
+        <w:rPr>
+          <w:rFonts w:ascii="Arial" w:eastAsia="Arial" w:hAnsi="Arial" w:cs="Arial"/>
+          <w:b/>
+          <w:bCs/>
+          <w:color w:val="000000"/>
+        </w:rPr>
+        <w:t>)</w:t>
+      </w:r>
+    </w:p>
+    <w:p>
+      <w:pPr>
+        <w:spacing w:after="100"/>
+      </w:pPr>
+      <w:r>
+        <w:t>I learned how to create a feature branch from develop, add my about.html page, and open a Pull Request. The main challenge was initially targeting main instead of develop, which meant my CI workflow didn't trigger. Once I edited the PR base branch to develop, the CI ran successfully and passed. This helped me understand the importance of following branch naming conventions and targeting the correct branch for CI/CD to work properly.</w:t>
+      </w:r>
     </w:p>
     <w:sectPr>
-      <w:headerReference w:type="even" r:id="rId7"/>
-      <w:headerReference w:type="default" r:id="rId8"/>
-      <w:footerReference w:type="even" r:id="rId9"/>
-      <w:footerReference w:type="default" r:id="rId10"/>
-      <w:headerReference w:type="first" r:id="rId11"/>
-      <w:footerReference w:type="first" r:id="rId12"/>
+      <w:headerReference w:type="even" r:id="rId20"/>
+      <w:headerReference w:type="default" r:id="rId21"/>
+      <w:footerReference w:type="even" r:id="rId22"/>
+      <w:footerReference w:type="default" r:id="rId23"/>
+      <w:headerReference w:type="first" r:id="rId24"/>
+      <w:footerReference w:type="first" r:id="rId25"/>
       <w:pgSz w:w="12240" w:h="15840"/>
       <w:pgMar w:top="1080" w:right="1080" w:bottom="1080" w:left="1080" w:header="708" w:footer="708" w:gutter="0"/>
       <w:cols w:space="720"/>
@@ -10472,7 +11432,17 @@
         <w:sz w:val="16"/>
         <w:szCs w:val="16"/>
       </w:rPr>
-      <w:t xml:space="preserve">Assignment 04 – CI/CD Pipeline Integration  </w:t>
+      <w:t xml:space="preserve">Assignment 04 – CI/CD Pipeline </w:t>
+    </w:r>
+    <w:proofErr w:type="gramStart"/>
+    <w:r>
+      <w:rPr>
+        <w:rFonts w:ascii="Arial" w:eastAsia="Arial" w:hAnsi="Arial" w:cs="Arial"/>
+        <w:color w:val="555555"/>
+        <w:sz w:val="16"/>
+        <w:szCs w:val="16"/>
+      </w:rPr>
+      <w:t xml:space="preserve">Integration  </w:t>
     </w:r>
     <w:r>
       <w:rPr>
@@ -10482,6 +11452,15 @@
         <w:szCs w:val="16"/>
       </w:rPr>
       <w:tab/>
+    </w:r>
+    <w:proofErr w:type="gramEnd"/>
+    <w:r>
+      <w:rPr>
+        <w:rFonts w:ascii="Arial" w:eastAsia="Arial" w:hAnsi="Arial" w:cs="Arial"/>
+        <w:color w:val="555555"/>
+        <w:sz w:val="16"/>
+        <w:szCs w:val="16"/>
+      </w:rPr>
       <w:t xml:space="preserve"> Page </w:t>
     </w:r>
     <w:r>
@@ -10592,7 +11571,19 @@
         <w:sz w:val="18"/>
         <w:szCs w:val="18"/>
       </w:rPr>
-      <w:t>University of Central Punjab – Faculty of Information Technology</w:t>
+      <w:t xml:space="preserve">University of Central Punjab – Faculty of Information </w:t>
+    </w:r>
+    <w:proofErr w:type="gramStart"/>
+    <w:r>
+      <w:rPr>
+        <w:rFonts w:ascii="Arial" w:eastAsia="Arial" w:hAnsi="Arial" w:cs="Arial"/>
+        <w:b/>
+        <w:bCs/>
+        <w:color w:val="1F3864"/>
+        <w:sz w:val="18"/>
+        <w:szCs w:val="18"/>
+      </w:rPr>
+      <w:t>Technology</w:t>
     </w:r>
     <w:r>
       <w:rPr>
@@ -10601,7 +11592,17 @@
         <w:sz w:val="18"/>
         <w:szCs w:val="18"/>
       </w:rPr>
-      <w:t xml:space="preserve">  |  </w:t>
+      <w:t xml:space="preserve">  |</w:t>
+    </w:r>
+    <w:proofErr w:type="gramEnd"/>
+    <w:r>
+      <w:rPr>
+        <w:rFonts w:ascii="Arial" w:eastAsia="Arial" w:hAnsi="Arial" w:cs="Arial"/>
+        <w:color w:val="ADB9CA"/>
+        <w:sz w:val="18"/>
+        <w:szCs w:val="18"/>
+      </w:rPr>
+      <w:t xml:space="preserve">  </w:t>
     </w:r>
     <w:r>
       <w:rPr>

</xml_diff>